<commit_message>
Backend Changes for analyser p1
</commit_message>
<xml_diff>
--- a/docs/OSS-RISK-Assesment.docx
+++ b/docs/OSS-RISK-Assesment.docx
@@ -61,7 +61,7 @@
     <w:p>
       <w:r>
         <w:pict w14:anchorId="2C340DE0">
-          <v:rect id="_x0000_i1085" style="width:0;height:1.5pt" o:hralign="center" o:hrstd="t" o:hr="t" fillcolor="#a0a0a0" stroked="f"/>
+          <v:rect id="_x0000_i1025" style="width:0;height:1.5pt" o:hralign="center" o:hrstd="t" o:hr="t" fillcolor="#a0a0a0" stroked="f"/>
         </w:pict>
       </w:r>
     </w:p>
@@ -197,7 +197,7 @@
     <w:p>
       <w:r>
         <w:pict w14:anchorId="64051441">
-          <v:rect id="_x0000_i1086" style="width:0;height:1.5pt" o:hralign="center" o:hrstd="t" o:hr="t" fillcolor="#a0a0a0" stroked="f"/>
+          <v:rect id="_x0000_i1026" style="width:0;height:1.5pt" o:hralign="center" o:hrstd="t" o:hr="t" fillcolor="#a0a0a0" stroked="f"/>
         </w:pict>
       </w:r>
     </w:p>
@@ -333,7 +333,7 @@
     <w:p>
       <w:r>
         <w:pict w14:anchorId="31E6DF33">
-          <v:rect id="_x0000_i1087" style="width:0;height:1.5pt" o:hralign="center" o:hrstd="t" o:hr="t" fillcolor="#a0a0a0" stroked="f"/>
+          <v:rect id="_x0000_i1027" style="width:0;height:1.5pt" o:hralign="center" o:hrstd="t" o:hr="t" fillcolor="#a0a0a0" stroked="f"/>
         </w:pict>
       </w:r>
     </w:p>
@@ -472,7 +472,7 @@
     <w:p>
       <w:r>
         <w:pict w14:anchorId="010D7C5A">
-          <v:rect id="_x0000_i1088" style="width:0;height:1.5pt" o:hralign="center" o:hrstd="t" o:hr="t" fillcolor="#a0a0a0" stroked="f"/>
+          <v:rect id="_x0000_i1028" style="width:0;height:1.5pt" o:hralign="center" o:hrstd="t" o:hr="t" fillcolor="#a0a0a0" stroked="f"/>
         </w:pict>
       </w:r>
     </w:p>
@@ -584,7 +584,7 @@
     <w:p>
       <w:r>
         <w:pict w14:anchorId="7D682D7B">
-          <v:rect id="_x0000_i1089" style="width:0;height:1.5pt" o:hralign="center" o:hrstd="t" o:hr="t" fillcolor="#a0a0a0" stroked="f"/>
+          <v:rect id="_x0000_i1029" style="width:0;height:1.5pt" o:hralign="center" o:hrstd="t" o:hr="t" fillcolor="#a0a0a0" stroked="f"/>
         </w:pict>
       </w:r>
     </w:p>
@@ -744,7 +744,7 @@
     <w:p>
       <w:r>
         <w:pict w14:anchorId="20A5CF02">
-          <v:rect id="_x0000_i1090" style="width:0;height:1.5pt" o:hralign="center" o:hrstd="t" o:hr="t" fillcolor="#a0a0a0" stroked="f"/>
+          <v:rect id="_x0000_i1030" style="width:0;height:1.5pt" o:hralign="center" o:hrstd="t" o:hr="t" fillcolor="#a0a0a0" stroked="f"/>
         </w:pict>
       </w:r>
     </w:p>
@@ -835,7 +835,7 @@
     <w:p>
       <w:r>
         <w:pict w14:anchorId="14034065">
-          <v:rect id="_x0000_i1091" style="width:0;height:1.5pt" o:hralign="center" o:hrstd="t" o:hr="t" fillcolor="#a0a0a0" stroked="f"/>
+          <v:rect id="_x0000_i1031" style="width:0;height:1.5pt" o:hralign="center" o:hrstd="t" o:hr="t" fillcolor="#a0a0a0" stroked="f"/>
         </w:pict>
       </w:r>
     </w:p>
@@ -853,11 +853,51 @@
         </w:rPr>
         <w:t>7. Detailed Plan of Work (Mapped to BITS Timeline)</w:t>
       </w:r>
+    </w:p>
+    <w:p>
+      <w:pPr>
+        <w:rPr>
+          <w:b/>
+          <w:bCs/>
+        </w:rPr>
+      </w:pPr>
+    </w:p>
+    <w:p>
+      <w:pPr>
+        <w:rPr>
+          <w:b/>
+          <w:bCs/>
+        </w:rPr>
+      </w:pPr>
+    </w:p>
+    <w:p>
+      <w:pPr>
+        <w:rPr>
+          <w:b/>
+          <w:bCs/>
+        </w:rPr>
+      </w:pPr>
+    </w:p>
+    <w:p>
+      <w:pPr>
+        <w:rPr>
+          <w:b/>
+          <w:bCs/>
+        </w:rPr>
+      </w:pPr>
     </w:p>
     <w:tbl>
       <w:tblPr>
         <w:tblW w:w="0" w:type="auto"/>
         <w:tblCellSpacing w:w="15" w:type="dxa"/>
+        <w:tblBorders>
+          <w:top w:val="single" w:sz="4" w:space="0" w:color="auto"/>
+          <w:left w:val="single" w:sz="4" w:space="0" w:color="auto"/>
+          <w:bottom w:val="single" w:sz="4" w:space="0" w:color="auto"/>
+          <w:right w:val="single" w:sz="4" w:space="0" w:color="auto"/>
+          <w:insideH w:val="single" w:sz="4" w:space="0" w:color="auto"/>
+          <w:insideV w:val="single" w:sz="4" w:space="0" w:color="auto"/>
+        </w:tblBorders>
         <w:tblCellMar>
           <w:top w:w="15" w:type="dxa"/>
           <w:left w:w="15" w:type="dxa"/>
@@ -867,10 +907,10 @@
         <w:tblLook w:val="04A0" w:firstRow="1" w:lastRow="0" w:firstColumn="1" w:lastColumn="0" w:noHBand="0" w:noVBand="1"/>
       </w:tblPr>
       <w:tblGrid>
-        <w:gridCol w:w="1261"/>
-        <w:gridCol w:w="835"/>
-        <w:gridCol w:w="4336"/>
-        <w:gridCol w:w="2928"/>
+        <w:gridCol w:w="895"/>
+        <w:gridCol w:w="3530"/>
+        <w:gridCol w:w="2500"/>
+        <w:gridCol w:w="2425"/>
       </w:tblGrid>
       <w:tr>
         <w:trPr>
@@ -878,9 +918,8 @@
         </w:trPr>
         <w:tc>
           <w:tcPr>
-            <w:tcW w:w="0" w:type="auto"/>
-            <w:vAlign w:val="center"/>
-            <w:hideMark/>
+            <w:tcW w:w="850" w:type="dxa"/>
+            <w:vAlign w:val="center"/>
           </w:tcPr>
           <w:p>
             <w:pPr>
@@ -894,15 +933,15 @@
                 <w:b/>
                 <w:bCs/>
               </w:rPr>
-              <w:t>BITS Timeline</w:t>
+              <w:lastRenderedPageBreak/>
+              <w:t>S. No.</w:t>
             </w:r>
           </w:p>
         </w:tc>
         <w:tc>
           <w:tcPr>
-            <w:tcW w:w="0" w:type="auto"/>
-            <w:vAlign w:val="center"/>
-            <w:hideMark/>
+            <w:tcW w:w="3500" w:type="dxa"/>
+            <w:vAlign w:val="center"/>
           </w:tcPr>
           <w:p>
             <w:pPr>
@@ -916,15 +955,14 @@
                 <w:b/>
                 <w:bCs/>
               </w:rPr>
-              <w:t>Week</w:t>
+              <w:t>Tasks / Subtasks to be done</w:t>
             </w:r>
           </w:p>
         </w:tc>
         <w:tc>
           <w:tcPr>
-            <w:tcW w:w="0" w:type="auto"/>
-            <w:vAlign w:val="center"/>
-            <w:hideMark/>
+            <w:tcW w:w="2470" w:type="dxa"/>
+            <w:vAlign w:val="center"/>
           </w:tcPr>
           <w:p>
             <w:pPr>
@@ -938,15 +976,14 @@
                 <w:b/>
                 <w:bCs/>
               </w:rPr>
-              <w:t>Task</w:t>
+              <w:t>Planned Duration</w:t>
             </w:r>
           </w:p>
         </w:tc>
         <w:tc>
           <w:tcPr>
-            <w:tcW w:w="0" w:type="auto"/>
-            <w:vAlign w:val="center"/>
-            <w:hideMark/>
+            <w:tcW w:w="2380" w:type="dxa"/>
+            <w:vAlign w:val="center"/>
           </w:tcPr>
           <w:p>
             <w:pPr>
@@ -960,7 +997,7 @@
                 <w:b/>
                 <w:bCs/>
               </w:rPr>
-              <w:t>Deliverables</w:t>
+              <w:t>Specific Deliverable</w:t>
             </w:r>
           </w:p>
         </w:tc>
@@ -971,53 +1008,85 @@
         </w:trPr>
         <w:tc>
           <w:tcPr>
-            <w:tcW w:w="0" w:type="auto"/>
-            <w:vAlign w:val="center"/>
-            <w:hideMark/>
+            <w:tcW w:w="850" w:type="dxa"/>
+            <w:vAlign w:val="center"/>
           </w:tcPr>
           <w:p>
+            <w:pPr>
+              <w:rPr>
+                <w:b/>
+                <w:bCs/>
+              </w:rPr>
+            </w:pPr>
             <w:r>
               <w:rPr>
                 <w:b/>
                 <w:bCs/>
               </w:rPr>
-              <w:t>Jul 29 – Aug 2</w:t>
+              <w:t>1</w:t>
             </w:r>
           </w:p>
         </w:tc>
         <w:tc>
           <w:tcPr>
-            <w:tcW w:w="0" w:type="auto"/>
-            <w:vAlign w:val="center"/>
-            <w:hideMark/>
+            <w:tcW w:w="3500" w:type="dxa"/>
+            <w:vAlign w:val="center"/>
           </w:tcPr>
           <w:p>
+            <w:pPr>
+              <w:rPr>
+                <w:b/>
+                <w:bCs/>
+              </w:rPr>
+            </w:pPr>
             <w:r>
-              <w:t>Pre-week</w:t>
+              <w:rPr>
+                <w:b/>
+                <w:bCs/>
+              </w:rPr>
+              <w:t>Finalize architecture, tools, tech stack, and repo setup</w:t>
             </w:r>
           </w:p>
         </w:tc>
         <w:tc>
           <w:tcPr>
-            <w:tcW w:w="0" w:type="auto"/>
-            <w:vAlign w:val="center"/>
-            <w:hideMark/>
+            <w:tcW w:w="2470" w:type="dxa"/>
+            <w:vAlign w:val="center"/>
           </w:tcPr>
           <w:p>
+            <w:pPr>
+              <w:rPr>
+                <w:b/>
+                <w:bCs/>
+              </w:rPr>
+            </w:pPr>
             <w:r>
-              <w:t>Finalize title, literature review, methodology. Upload dissertation outline.</w:t>
+              <w:rPr>
+                <w:b/>
+                <w:bCs/>
+              </w:rPr>
+              <w:t>Week 1 – Week 2</w:t>
             </w:r>
           </w:p>
         </w:tc>
         <w:tc>
           <w:tcPr>
-            <w:tcW w:w="0" w:type="auto"/>
-            <w:vAlign w:val="center"/>
-            <w:hideMark/>
+            <w:tcW w:w="2380" w:type="dxa"/>
+            <w:vAlign w:val="center"/>
           </w:tcPr>
           <w:p>
+            <w:pPr>
+              <w:rPr>
+                <w:b/>
+                <w:bCs/>
+              </w:rPr>
+            </w:pPr>
             <w:r>
-              <w:t>Outline document &amp; supervisor approval</w:t>
+              <w:rPr>
+                <w:b/>
+                <w:bCs/>
+              </w:rPr>
+              <w:t>Project scaffold + system design diagram</w:t>
             </w:r>
           </w:p>
         </w:tc>
@@ -1028,54 +1097,85 @@
         </w:trPr>
         <w:tc>
           <w:tcPr>
-            <w:tcW w:w="0" w:type="auto"/>
-            <w:vAlign w:val="center"/>
-            <w:hideMark/>
+            <w:tcW w:w="850" w:type="dxa"/>
+            <w:vAlign w:val="center"/>
           </w:tcPr>
           <w:p>
+            <w:pPr>
+              <w:rPr>
+                <w:b/>
+                <w:bCs/>
+              </w:rPr>
+            </w:pPr>
             <w:r>
               <w:rPr>
                 <w:b/>
                 <w:bCs/>
               </w:rPr>
-              <w:lastRenderedPageBreak/>
-              <w:t>Aug 4</w:t>
+              <w:t>2</w:t>
             </w:r>
           </w:p>
         </w:tc>
         <w:tc>
           <w:tcPr>
-            <w:tcW w:w="0" w:type="auto"/>
-            <w:vAlign w:val="center"/>
-            <w:hideMark/>
+            <w:tcW w:w="3500" w:type="dxa"/>
+            <w:vAlign w:val="center"/>
           </w:tcPr>
           <w:p>
+            <w:pPr>
+              <w:rPr>
+                <w:b/>
+                <w:bCs/>
+              </w:rPr>
+            </w:pPr>
             <w:r>
-              <w:t>Week 1</w:t>
+              <w:rPr>
+                <w:b/>
+                <w:bCs/>
+              </w:rPr>
+              <w:t>GitHub repo cloning and dependency extraction (Spring Boot API)</w:t>
             </w:r>
           </w:p>
         </w:tc>
         <w:tc>
           <w:tcPr>
-            <w:tcW w:w="0" w:type="auto"/>
-            <w:vAlign w:val="center"/>
-            <w:hideMark/>
+            <w:tcW w:w="2470" w:type="dxa"/>
+            <w:vAlign w:val="center"/>
           </w:tcPr>
           <w:p>
+            <w:pPr>
+              <w:rPr>
+                <w:b/>
+                <w:bCs/>
+              </w:rPr>
+            </w:pPr>
             <w:r>
-              <w:t>Setup repo, finalize architecture &amp; tech stack</w:t>
+              <w:rPr>
+                <w:b/>
+                <w:bCs/>
+              </w:rPr>
+              <w:t>Week 2 – Week 3</w:t>
             </w:r>
           </w:p>
         </w:tc>
         <w:tc>
           <w:tcPr>
-            <w:tcW w:w="0" w:type="auto"/>
-            <w:vAlign w:val="center"/>
-            <w:hideMark/>
+            <w:tcW w:w="2380" w:type="dxa"/>
+            <w:vAlign w:val="center"/>
           </w:tcPr>
           <w:p>
+            <w:pPr>
+              <w:rPr>
+                <w:b/>
+                <w:bCs/>
+              </w:rPr>
+            </w:pPr>
             <w:r>
-              <w:t>Architecture diagram, finalized methodology</w:t>
+              <w:rPr>
+                <w:b/>
+                <w:bCs/>
+              </w:rPr>
+              <w:t>Working backend that extracts repo dependencies</w:t>
             </w:r>
           </w:p>
         </w:tc>
@@ -1086,53 +1186,85 @@
         </w:trPr>
         <w:tc>
           <w:tcPr>
-            <w:tcW w:w="0" w:type="auto"/>
-            <w:vAlign w:val="center"/>
-            <w:hideMark/>
+            <w:tcW w:w="850" w:type="dxa"/>
+            <w:vAlign w:val="center"/>
           </w:tcPr>
           <w:p>
+            <w:pPr>
+              <w:rPr>
+                <w:b/>
+                <w:bCs/>
+              </w:rPr>
+            </w:pPr>
             <w:r>
               <w:rPr>
                 <w:b/>
                 <w:bCs/>
               </w:rPr>
-              <w:t>Aug 10</w:t>
+              <w:t>3</w:t>
             </w:r>
           </w:p>
         </w:tc>
         <w:tc>
           <w:tcPr>
-            <w:tcW w:w="0" w:type="auto"/>
-            <w:vAlign w:val="center"/>
-            <w:hideMark/>
+            <w:tcW w:w="3500" w:type="dxa"/>
+            <w:vAlign w:val="center"/>
           </w:tcPr>
           <w:p>
+            <w:pPr>
+              <w:rPr>
+                <w:b/>
+                <w:bCs/>
+              </w:rPr>
+            </w:pPr>
             <w:r>
-              <w:t>Week 2</w:t>
+              <w:rPr>
+                <w:b/>
+                <w:bCs/>
+              </w:rPr>
+              <w:t>Integrate dependency risk analysis (OSS Index / Libraries.io)</w:t>
             </w:r>
           </w:p>
         </w:tc>
         <w:tc>
           <w:tcPr>
-            <w:tcW w:w="0" w:type="auto"/>
-            <w:vAlign w:val="center"/>
-            <w:hideMark/>
+            <w:tcW w:w="2470" w:type="dxa"/>
+            <w:vAlign w:val="center"/>
           </w:tcPr>
           <w:p>
+            <w:pPr>
+              <w:rPr>
+                <w:b/>
+                <w:bCs/>
+              </w:rPr>
+            </w:pPr>
             <w:r>
-              <w:t>Backend setup: Repo cloning, code parsing, dependency scanning</w:t>
+              <w:rPr>
+                <w:b/>
+                <w:bCs/>
+              </w:rPr>
+              <w:t>Week 3 – Week 4</w:t>
             </w:r>
           </w:p>
         </w:tc>
         <w:tc>
           <w:tcPr>
-            <w:tcW w:w="0" w:type="auto"/>
-            <w:vAlign w:val="center"/>
-            <w:hideMark/>
+            <w:tcW w:w="2380" w:type="dxa"/>
+            <w:vAlign w:val="center"/>
           </w:tcPr>
           <w:p>
+            <w:pPr>
+              <w:rPr>
+                <w:b/>
+                <w:bCs/>
+              </w:rPr>
+            </w:pPr>
             <w:r>
-              <w:t>Initial backend APIs</w:t>
+              <w:rPr>
+                <w:b/>
+                <w:bCs/>
+              </w:rPr>
+              <w:t>Dependency health and version risk detection</w:t>
             </w:r>
           </w:p>
         </w:tc>
@@ -1143,53 +1275,85 @@
         </w:trPr>
         <w:tc>
           <w:tcPr>
-            <w:tcW w:w="0" w:type="auto"/>
-            <w:vAlign w:val="center"/>
-            <w:hideMark/>
+            <w:tcW w:w="850" w:type="dxa"/>
+            <w:vAlign w:val="center"/>
           </w:tcPr>
           <w:p>
+            <w:pPr>
+              <w:rPr>
+                <w:b/>
+                <w:bCs/>
+              </w:rPr>
+            </w:pPr>
             <w:r>
               <w:rPr>
                 <w:b/>
                 <w:bCs/>
               </w:rPr>
-              <w:t>Aug 17</w:t>
+              <w:t>4</w:t>
             </w:r>
           </w:p>
         </w:tc>
         <w:tc>
           <w:tcPr>
-            <w:tcW w:w="0" w:type="auto"/>
-            <w:vAlign w:val="center"/>
-            <w:hideMark/>
+            <w:tcW w:w="3500" w:type="dxa"/>
+            <w:vAlign w:val="center"/>
           </w:tcPr>
           <w:p>
+            <w:pPr>
+              <w:rPr>
+                <w:b/>
+                <w:bCs/>
+              </w:rPr>
+            </w:pPr>
             <w:r>
-              <w:t>Week 3</w:t>
+              <w:rPr>
+                <w:b/>
+                <w:bCs/>
+              </w:rPr>
+              <w:t>Implement vulnerability scanner (NVD/CVE API)</w:t>
             </w:r>
           </w:p>
         </w:tc>
         <w:tc>
           <w:tcPr>
-            <w:tcW w:w="0" w:type="auto"/>
-            <w:vAlign w:val="center"/>
-            <w:hideMark/>
+            <w:tcW w:w="2470" w:type="dxa"/>
+            <w:vAlign w:val="center"/>
           </w:tcPr>
           <w:p>
+            <w:pPr>
+              <w:rPr>
+                <w:b/>
+                <w:bCs/>
+              </w:rPr>
+            </w:pPr>
             <w:r>
-              <w:t>Integrate vulnerability scanner (OSS Index, NVD API)</w:t>
+              <w:rPr>
+                <w:b/>
+                <w:bCs/>
+              </w:rPr>
+              <w:t>Week 4 – Week 5</w:t>
             </w:r>
           </w:p>
         </w:tc>
         <w:tc>
           <w:tcPr>
-            <w:tcW w:w="0" w:type="auto"/>
-            <w:vAlign w:val="center"/>
-            <w:hideMark/>
+            <w:tcW w:w="2380" w:type="dxa"/>
+            <w:vAlign w:val="center"/>
           </w:tcPr>
           <w:p>
+            <w:pPr>
+              <w:rPr>
+                <w:b/>
+                <w:bCs/>
+              </w:rPr>
+            </w:pPr>
             <w:r>
-              <w:t>Vulnerability detection module</w:t>
+              <w:rPr>
+                <w:b/>
+                <w:bCs/>
+              </w:rPr>
+              <w:t>Vulnerability mapping for dependencies</w:t>
             </w:r>
           </w:p>
         </w:tc>
@@ -1200,53 +1364,117 @@
         </w:trPr>
         <w:tc>
           <w:tcPr>
-            <w:tcW w:w="0" w:type="auto"/>
-            <w:vAlign w:val="center"/>
-            <w:hideMark/>
+            <w:tcW w:w="850" w:type="dxa"/>
+            <w:vAlign w:val="center"/>
           </w:tcPr>
           <w:p>
+            <w:pPr>
+              <w:rPr>
+                <w:b/>
+                <w:bCs/>
+              </w:rPr>
+            </w:pPr>
             <w:r>
               <w:rPr>
                 <w:b/>
                 <w:bCs/>
               </w:rPr>
-              <w:t>Aug 24</w:t>
+              <w:t>5</w:t>
             </w:r>
           </w:p>
         </w:tc>
         <w:tc>
           <w:tcPr>
-            <w:tcW w:w="0" w:type="auto"/>
-            <w:vAlign w:val="center"/>
-            <w:hideMark/>
+            <w:tcW w:w="3500" w:type="dxa"/>
+            <w:vAlign w:val="center"/>
           </w:tcPr>
           <w:p>
+            <w:pPr>
+              <w:rPr>
+                <w:b/>
+                <w:bCs/>
+              </w:rPr>
+            </w:pPr>
             <w:r>
-              <w:t>Week 4</w:t>
+              <w:rPr>
+                <w:b/>
+                <w:bCs/>
+              </w:rPr>
+              <w:t xml:space="preserve">Build </w:t>
+            </w:r>
+            <w:proofErr w:type="gramStart"/>
+            <w:r>
+              <w:rPr>
+                <w:b/>
+                <w:bCs/>
+              </w:rPr>
+              <w:t>Angular</w:t>
+            </w:r>
+            <w:proofErr w:type="gramEnd"/>
+            <w:r>
+              <w:rPr>
+                <w:b/>
+                <w:bCs/>
+              </w:rPr>
+              <w:t xml:space="preserve"> frontend for </w:t>
+            </w:r>
+            <w:proofErr w:type="gramStart"/>
+            <w:r>
+              <w:rPr>
+                <w:b/>
+                <w:bCs/>
+              </w:rPr>
+              <w:t>dependency</w:t>
+            </w:r>
+            <w:proofErr w:type="gramEnd"/>
+            <w:r>
+              <w:rPr>
+                <w:b/>
+                <w:bCs/>
+              </w:rPr>
+              <w:t xml:space="preserve"> list + basic risk dashboard</w:t>
             </w:r>
           </w:p>
         </w:tc>
         <w:tc>
           <w:tcPr>
-            <w:tcW w:w="0" w:type="auto"/>
-            <w:vAlign w:val="center"/>
-            <w:hideMark/>
+            <w:tcW w:w="2470" w:type="dxa"/>
+            <w:vAlign w:val="center"/>
           </w:tcPr>
           <w:p>
+            <w:pPr>
+              <w:rPr>
+                <w:b/>
+                <w:bCs/>
+              </w:rPr>
+            </w:pPr>
             <w:r>
-              <w:t>ML pipeline skeleton for risk scoring</w:t>
+              <w:rPr>
+                <w:b/>
+                <w:bCs/>
+              </w:rPr>
+              <w:t>Week 5 – Week 6</w:t>
             </w:r>
           </w:p>
         </w:tc>
         <w:tc>
           <w:tcPr>
-            <w:tcW w:w="0" w:type="auto"/>
-            <w:vAlign w:val="center"/>
-            <w:hideMark/>
+            <w:tcW w:w="2380" w:type="dxa"/>
+            <w:vAlign w:val="center"/>
           </w:tcPr>
           <w:p>
+            <w:pPr>
+              <w:rPr>
+                <w:b/>
+                <w:bCs/>
+              </w:rPr>
+            </w:pPr>
             <w:r>
-              <w:t>Draft ML model</w:t>
+              <w:rPr>
+                <w:b/>
+                <w:bCs/>
+              </w:rPr>
+              <w:t>Frontend showing dependency risks with color coding</w:t>
             </w:r>
           </w:p>
         </w:tc>
@@ -1257,53 +1485,85 @@
         </w:trPr>
         <w:tc>
           <w:tcPr>
-            <w:tcW w:w="0" w:type="auto"/>
-            <w:vAlign w:val="center"/>
-            <w:hideMark/>
+            <w:tcW w:w="850" w:type="dxa"/>
+            <w:vAlign w:val="center"/>
           </w:tcPr>
           <w:p>
+            <w:pPr>
+              <w:rPr>
+                <w:b/>
+                <w:bCs/>
+              </w:rPr>
+            </w:pPr>
             <w:r>
               <w:rPr>
                 <w:b/>
                 <w:bCs/>
               </w:rPr>
-              <w:t>Aug 31</w:t>
+              <w:t>6</w:t>
             </w:r>
           </w:p>
         </w:tc>
         <w:tc>
           <w:tcPr>
-            <w:tcW w:w="0" w:type="auto"/>
-            <w:vAlign w:val="center"/>
-            <w:hideMark/>
+            <w:tcW w:w="3500" w:type="dxa"/>
+            <w:vAlign w:val="center"/>
           </w:tcPr>
           <w:p>
+            <w:pPr>
+              <w:rPr>
+                <w:b/>
+                <w:bCs/>
+              </w:rPr>
+            </w:pPr>
             <w:r>
-              <w:t>Week 5</w:t>
+              <w:rPr>
+                <w:b/>
+                <w:bCs/>
+              </w:rPr>
+              <w:t>Implement static code analyzer using AST (Python/Java)</w:t>
             </w:r>
           </w:p>
         </w:tc>
         <w:tc>
           <w:tcPr>
-            <w:tcW w:w="0" w:type="auto"/>
-            <w:vAlign w:val="center"/>
-            <w:hideMark/>
+            <w:tcW w:w="2470" w:type="dxa"/>
+            <w:vAlign w:val="center"/>
           </w:tcPr>
           <w:p>
+            <w:pPr>
+              <w:rPr>
+                <w:b/>
+                <w:bCs/>
+              </w:rPr>
+            </w:pPr>
             <w:r>
-              <w:t>Implement Code Analyzer &amp; Dependency Health Scorer</w:t>
+              <w:rPr>
+                <w:b/>
+                <w:bCs/>
+              </w:rPr>
+              <w:t>Week 6 – Week 7</w:t>
             </w:r>
           </w:p>
         </w:tc>
         <w:tc>
           <w:tcPr>
-            <w:tcW w:w="0" w:type="auto"/>
-            <w:vAlign w:val="center"/>
-            <w:hideMark/>
+            <w:tcW w:w="2380" w:type="dxa"/>
+            <w:vAlign w:val="center"/>
           </w:tcPr>
           <w:p>
+            <w:pPr>
+              <w:rPr>
+                <w:b/>
+                <w:bCs/>
+              </w:rPr>
+            </w:pPr>
             <w:r>
-              <w:t>Code smell + dependency analyzer</w:t>
+              <w:rPr>
+                <w:b/>
+                <w:bCs/>
+              </w:rPr>
+              <w:t>Code smell and complexity detection module</w:t>
             </w:r>
           </w:p>
         </w:tc>
@@ -1314,53 +1574,85 @@
         </w:trPr>
         <w:tc>
           <w:tcPr>
-            <w:tcW w:w="0" w:type="auto"/>
-            <w:vAlign w:val="center"/>
-            <w:hideMark/>
+            <w:tcW w:w="850" w:type="dxa"/>
+            <w:vAlign w:val="center"/>
           </w:tcPr>
           <w:p>
+            <w:pPr>
+              <w:rPr>
+                <w:b/>
+                <w:bCs/>
+              </w:rPr>
+            </w:pPr>
             <w:r>
               <w:rPr>
                 <w:b/>
                 <w:bCs/>
               </w:rPr>
-              <w:t>Sep 7</w:t>
+              <w:t>7</w:t>
             </w:r>
           </w:p>
         </w:tc>
         <w:tc>
           <w:tcPr>
-            <w:tcW w:w="0" w:type="auto"/>
-            <w:vAlign w:val="center"/>
-            <w:hideMark/>
+            <w:tcW w:w="3500" w:type="dxa"/>
+            <w:vAlign w:val="center"/>
           </w:tcPr>
           <w:p>
+            <w:pPr>
+              <w:rPr>
+                <w:b/>
+                <w:bCs/>
+              </w:rPr>
+            </w:pPr>
             <w:r>
-              <w:t>Week 6</w:t>
+              <w:rPr>
+                <w:b/>
+                <w:bCs/>
+              </w:rPr>
+              <w:t>Integrate and display code quality data in UI</w:t>
             </w:r>
           </w:p>
         </w:tc>
         <w:tc>
           <w:tcPr>
-            <w:tcW w:w="0" w:type="auto"/>
-            <w:vAlign w:val="center"/>
-            <w:hideMark/>
+            <w:tcW w:w="2470" w:type="dxa"/>
+            <w:vAlign w:val="center"/>
           </w:tcPr>
           <w:p>
+            <w:pPr>
+              <w:rPr>
+                <w:b/>
+                <w:bCs/>
+              </w:rPr>
+            </w:pPr>
             <w:r>
-              <w:t>Build Knowledge Graph Builder</w:t>
+              <w:rPr>
+                <w:b/>
+                <w:bCs/>
+              </w:rPr>
+              <w:t>Week 7 – Week 8</w:t>
             </w:r>
           </w:p>
         </w:tc>
         <w:tc>
           <w:tcPr>
-            <w:tcW w:w="0" w:type="auto"/>
-            <w:vAlign w:val="center"/>
-            <w:hideMark/>
+            <w:tcW w:w="2380" w:type="dxa"/>
+            <w:vAlign w:val="center"/>
           </w:tcPr>
           <w:p>
+            <w:pPr>
+              <w:rPr>
+                <w:b/>
+                <w:bCs/>
+              </w:rPr>
+            </w:pPr>
             <w:r>
-              <w:t>Graph data prototype</w:t>
+              <w:rPr>
+                <w:b/>
+                <w:bCs/>
+              </w:rPr>
+              <w:t>UI section for code smells &amp; maintainability</w:t>
             </w:r>
           </w:p>
         </w:tc>
@@ -1371,53 +1663,85 @@
         </w:trPr>
         <w:tc>
           <w:tcPr>
-            <w:tcW w:w="0" w:type="auto"/>
-            <w:vAlign w:val="center"/>
-            <w:hideMark/>
+            <w:tcW w:w="850" w:type="dxa"/>
+            <w:vAlign w:val="center"/>
           </w:tcPr>
           <w:p>
+            <w:pPr>
+              <w:rPr>
+                <w:b/>
+                <w:bCs/>
+              </w:rPr>
+            </w:pPr>
             <w:r>
               <w:rPr>
                 <w:b/>
                 <w:bCs/>
               </w:rPr>
-              <w:t>Sep 14</w:t>
+              <w:t>8</w:t>
             </w:r>
           </w:p>
         </w:tc>
         <w:tc>
           <w:tcPr>
-            <w:tcW w:w="0" w:type="auto"/>
-            <w:vAlign w:val="center"/>
-            <w:hideMark/>
+            <w:tcW w:w="3500" w:type="dxa"/>
+            <w:vAlign w:val="center"/>
           </w:tcPr>
           <w:p>
+            <w:pPr>
+              <w:rPr>
+                <w:b/>
+                <w:bCs/>
+              </w:rPr>
+            </w:pPr>
             <w:r>
-              <w:t>Week 7</w:t>
+              <w:rPr>
+                <w:b/>
+                <w:bCs/>
+              </w:rPr>
+              <w:t>Develop ML model for release risk scoring</w:t>
             </w:r>
           </w:p>
         </w:tc>
         <w:tc>
           <w:tcPr>
-            <w:tcW w:w="0" w:type="auto"/>
-            <w:vAlign w:val="center"/>
-            <w:hideMark/>
+            <w:tcW w:w="2470" w:type="dxa"/>
+            <w:vAlign w:val="center"/>
           </w:tcPr>
           <w:p>
+            <w:pPr>
+              <w:rPr>
+                <w:b/>
+                <w:bCs/>
+              </w:rPr>
+            </w:pPr>
             <w:r>
-              <w:t>NLP summarization for chatbot explanations</w:t>
+              <w:rPr>
+                <w:b/>
+                <w:bCs/>
+              </w:rPr>
+              <w:t>Week 8 – Week 9</w:t>
             </w:r>
           </w:p>
         </w:tc>
         <w:tc>
           <w:tcPr>
-            <w:tcW w:w="0" w:type="auto"/>
-            <w:vAlign w:val="center"/>
-            <w:hideMark/>
+            <w:tcW w:w="2380" w:type="dxa"/>
+            <w:vAlign w:val="center"/>
           </w:tcPr>
           <w:p>
+            <w:pPr>
+              <w:rPr>
+                <w:b/>
+                <w:bCs/>
+              </w:rPr>
+            </w:pPr>
             <w:r>
-              <w:t>AI Explanation Engine</w:t>
+              <w:rPr>
+                <w:b/>
+                <w:bCs/>
+              </w:rPr>
+              <w:t>API to predict risk score based on extracted features</w:t>
             </w:r>
           </w:p>
         </w:tc>
@@ -1428,60 +1752,85 @@
         </w:trPr>
         <w:tc>
           <w:tcPr>
-            <w:tcW w:w="0" w:type="auto"/>
-            <w:vAlign w:val="center"/>
-            <w:hideMark/>
+            <w:tcW w:w="850" w:type="dxa"/>
+            <w:vAlign w:val="center"/>
           </w:tcPr>
           <w:p>
+            <w:pPr>
+              <w:rPr>
+                <w:b/>
+                <w:bCs/>
+              </w:rPr>
+            </w:pPr>
             <w:r>
               <w:rPr>
                 <w:b/>
                 <w:bCs/>
               </w:rPr>
-              <w:t>Sep 21</w:t>
+              <w:t>9</w:t>
             </w:r>
           </w:p>
         </w:tc>
         <w:tc>
           <w:tcPr>
-            <w:tcW w:w="0" w:type="auto"/>
-            <w:vAlign w:val="center"/>
-            <w:hideMark/>
+            <w:tcW w:w="3500" w:type="dxa"/>
+            <w:vAlign w:val="center"/>
           </w:tcPr>
           <w:p>
+            <w:pPr>
+              <w:rPr>
+                <w:b/>
+                <w:bCs/>
+              </w:rPr>
+            </w:pPr>
             <w:r>
-              <w:t>Week 8</w:t>
+              <w:rPr>
+                <w:b/>
+                <w:bCs/>
+              </w:rPr>
+              <w:t>Train/test model and integrate with backend</w:t>
             </w:r>
           </w:p>
         </w:tc>
         <w:tc>
           <w:tcPr>
-            <w:tcW w:w="0" w:type="auto"/>
-            <w:vAlign w:val="center"/>
-            <w:hideMark/>
+            <w:tcW w:w="2470" w:type="dxa"/>
+            <w:vAlign w:val="center"/>
           </w:tcPr>
           <w:p>
+            <w:pPr>
+              <w:rPr>
+                <w:b/>
+                <w:bCs/>
+              </w:rPr>
+            </w:pPr>
             <w:r>
               <w:rPr>
                 <w:b/>
                 <w:bCs/>
               </w:rPr>
-              <w:t>Mid-Sem milestone</w:t>
-            </w:r>
-            <w:r>
-              <w:t>: Core integration. Prepare Mid-Sem report.</w:t>
+              <w:t>Week 9 – Week 10</w:t>
             </w:r>
           </w:p>
         </w:tc>
         <w:tc>
           <w:tcPr>
-            <w:tcW w:w="0" w:type="auto"/>
-            <w:vAlign w:val="center"/>
-            <w:hideMark/>
+            <w:tcW w:w="2380" w:type="dxa"/>
+            <w:vAlign w:val="center"/>
           </w:tcPr>
           <w:p>
+            <w:pPr>
+              <w:rPr>
+                <w:b/>
+                <w:bCs/>
+              </w:rPr>
+            </w:pPr>
             <w:r>
-              <w:t>Mid-Semester Report &amp; Seminar</w:t>
+              <w:rPr>
+                <w:b/>
+                <w:bCs/>
+              </w:rPr>
+              <w:t>Risk score shown per project in UI</w:t>
             </w:r>
           </w:p>
         </w:tc>
@@ -1492,57 +1841,85 @@
         </w:trPr>
         <w:tc>
           <w:tcPr>
-            <w:tcW w:w="0" w:type="auto"/>
-            <w:vAlign w:val="center"/>
-            <w:hideMark/>
+            <w:tcW w:w="850" w:type="dxa"/>
+            <w:vAlign w:val="center"/>
           </w:tcPr>
           <w:p>
+            <w:pPr>
+              <w:rPr>
+                <w:b/>
+                <w:bCs/>
+              </w:rPr>
+            </w:pPr>
             <w:r>
               <w:rPr>
                 <w:b/>
                 <w:bCs/>
               </w:rPr>
-              <w:t>Sep 21–24</w:t>
+              <w:t>10</w:t>
             </w:r>
           </w:p>
         </w:tc>
         <w:tc>
           <w:tcPr>
-            <w:tcW w:w="0" w:type="auto"/>
-            <w:vAlign w:val="center"/>
-            <w:hideMark/>
+            <w:tcW w:w="3500" w:type="dxa"/>
+            <w:vAlign w:val="center"/>
           </w:tcPr>
           <w:p>
+            <w:pPr>
+              <w:rPr>
+                <w:b/>
+                <w:bCs/>
+              </w:rPr>
+            </w:pPr>
             <w:r>
-              <w:t>—</w:t>
+              <w:rPr>
+                <w:b/>
+                <w:bCs/>
+              </w:rPr>
+              <w:t>Build knowledge graph (libraries ↔ contributors ↔ risks)</w:t>
             </w:r>
           </w:p>
         </w:tc>
         <w:tc>
           <w:tcPr>
-            <w:tcW w:w="0" w:type="auto"/>
-            <w:vAlign w:val="center"/>
-            <w:hideMark/>
+            <w:tcW w:w="2470" w:type="dxa"/>
+            <w:vAlign w:val="center"/>
           </w:tcPr>
           <w:p>
+            <w:pPr>
+              <w:rPr>
+                <w:b/>
+                <w:bCs/>
+              </w:rPr>
+            </w:pPr>
             <w:r>
               <w:rPr>
                 <w:b/>
                 <w:bCs/>
               </w:rPr>
-              <w:t>Mid-Semester Presentations</w:t>
+              <w:t>Week 10 – Week 11</w:t>
             </w:r>
           </w:p>
         </w:tc>
         <w:tc>
           <w:tcPr>
-            <w:tcW w:w="0" w:type="auto"/>
-            <w:vAlign w:val="center"/>
-            <w:hideMark/>
+            <w:tcW w:w="2380" w:type="dxa"/>
+            <w:vAlign w:val="center"/>
           </w:tcPr>
           <w:p>
+            <w:pPr>
+              <w:rPr>
+                <w:b/>
+                <w:bCs/>
+              </w:rPr>
+            </w:pPr>
             <w:r>
-              <w:t>Presentation to examiner</w:t>
+              <w:rPr>
+                <w:b/>
+                <w:bCs/>
+              </w:rPr>
+              <w:t>Graph data generated and stored</w:t>
             </w:r>
           </w:p>
         </w:tc>
@@ -1553,53 +1930,102 @@
         </w:trPr>
         <w:tc>
           <w:tcPr>
-            <w:tcW w:w="0" w:type="auto"/>
-            <w:vAlign w:val="center"/>
-            <w:hideMark/>
+            <w:tcW w:w="850" w:type="dxa"/>
+            <w:vAlign w:val="center"/>
           </w:tcPr>
           <w:p>
+            <w:pPr>
+              <w:rPr>
+                <w:b/>
+                <w:bCs/>
+              </w:rPr>
+            </w:pPr>
             <w:r>
               <w:rPr>
                 <w:b/>
                 <w:bCs/>
               </w:rPr>
-              <w:t>Sep 28</w:t>
+              <w:lastRenderedPageBreak/>
+              <w:t>11</w:t>
             </w:r>
           </w:p>
         </w:tc>
         <w:tc>
           <w:tcPr>
-            <w:tcW w:w="0" w:type="auto"/>
-            <w:vAlign w:val="center"/>
-            <w:hideMark/>
+            <w:tcW w:w="3500" w:type="dxa"/>
+            <w:vAlign w:val="center"/>
           </w:tcPr>
           <w:p>
+            <w:pPr>
+              <w:rPr>
+                <w:b/>
+                <w:bCs/>
+              </w:rPr>
+            </w:pPr>
             <w:r>
-              <w:t>Week 9</w:t>
+              <w:rPr>
+                <w:b/>
+                <w:bCs/>
+              </w:rPr>
+              <w:t xml:space="preserve">Visualize knowledge graph in Angular using D3.js / </w:t>
+            </w:r>
+            <w:proofErr w:type="spellStart"/>
+            <w:r>
+              <w:rPr>
+                <w:b/>
+                <w:bCs/>
+              </w:rPr>
+              <w:t>ngx</w:t>
+            </w:r>
+            <w:proofErr w:type="spellEnd"/>
+            <w:r>
+              <w:rPr>
+                <w:b/>
+                <w:bCs/>
+              </w:rPr>
+              <w:t>-graph</w:t>
             </w:r>
           </w:p>
         </w:tc>
         <w:tc>
           <w:tcPr>
-            <w:tcW w:w="0" w:type="auto"/>
-            <w:vAlign w:val="center"/>
-            <w:hideMark/>
+            <w:tcW w:w="2470" w:type="dxa"/>
+            <w:vAlign w:val="center"/>
           </w:tcPr>
           <w:p>
+            <w:pPr>
+              <w:rPr>
+                <w:b/>
+                <w:bCs/>
+              </w:rPr>
+            </w:pPr>
             <w:r>
-              <w:t>Start UI dashboard (heatmap + graph visualization)</w:t>
+              <w:rPr>
+                <w:b/>
+                <w:bCs/>
+              </w:rPr>
+              <w:t>Week 11 – Week 12</w:t>
             </w:r>
           </w:p>
         </w:tc>
         <w:tc>
           <w:tcPr>
-            <w:tcW w:w="0" w:type="auto"/>
-            <w:vAlign w:val="center"/>
-            <w:hideMark/>
+            <w:tcW w:w="2380" w:type="dxa"/>
+            <w:vAlign w:val="center"/>
           </w:tcPr>
           <w:p>
+            <w:pPr>
+              <w:rPr>
+                <w:b/>
+                <w:bCs/>
+              </w:rPr>
+            </w:pPr>
             <w:r>
-              <w:t>Initial frontend dashboard</w:t>
+              <w:rPr>
+                <w:b/>
+                <w:bCs/>
+              </w:rPr>
+              <w:t>Interactive knowledge graph in dashboard</w:t>
             </w:r>
           </w:p>
         </w:tc>
@@ -1610,53 +2036,85 @@
         </w:trPr>
         <w:tc>
           <w:tcPr>
-            <w:tcW w:w="0" w:type="auto"/>
-            <w:vAlign w:val="center"/>
-            <w:hideMark/>
+            <w:tcW w:w="850" w:type="dxa"/>
+            <w:vAlign w:val="center"/>
           </w:tcPr>
           <w:p>
+            <w:pPr>
+              <w:rPr>
+                <w:b/>
+                <w:bCs/>
+              </w:rPr>
+            </w:pPr>
             <w:r>
               <w:rPr>
                 <w:b/>
                 <w:bCs/>
               </w:rPr>
-              <w:t>Oct 5</w:t>
+              <w:t>12</w:t>
             </w:r>
           </w:p>
         </w:tc>
         <w:tc>
           <w:tcPr>
-            <w:tcW w:w="0" w:type="auto"/>
-            <w:vAlign w:val="center"/>
-            <w:hideMark/>
+            <w:tcW w:w="3500" w:type="dxa"/>
+            <w:vAlign w:val="center"/>
           </w:tcPr>
           <w:p>
+            <w:pPr>
+              <w:rPr>
+                <w:b/>
+                <w:bCs/>
+              </w:rPr>
+            </w:pPr>
             <w:r>
-              <w:t>Week 10</w:t>
+              <w:rPr>
+                <w:b/>
+                <w:bCs/>
+              </w:rPr>
+              <w:t>Develop AI NLP explanation engine (why risky + safer alternatives)</w:t>
             </w:r>
           </w:p>
         </w:tc>
         <w:tc>
           <w:tcPr>
-            <w:tcW w:w="0" w:type="auto"/>
-            <w:vAlign w:val="center"/>
-            <w:hideMark/>
+            <w:tcW w:w="2470" w:type="dxa"/>
+            <w:vAlign w:val="center"/>
           </w:tcPr>
           <w:p>
+            <w:pPr>
+              <w:rPr>
+                <w:b/>
+                <w:bCs/>
+              </w:rPr>
+            </w:pPr>
             <w:r>
-              <w:t>Chatbot UI + AI NLP integration</w:t>
+              <w:rPr>
+                <w:b/>
+                <w:bCs/>
+              </w:rPr>
+              <w:t>Week 12 – Week 13</w:t>
             </w:r>
           </w:p>
         </w:tc>
         <w:tc>
           <w:tcPr>
-            <w:tcW w:w="0" w:type="auto"/>
-            <w:vAlign w:val="center"/>
-            <w:hideMark/>
+            <w:tcW w:w="2380" w:type="dxa"/>
+            <w:vAlign w:val="center"/>
           </w:tcPr>
           <w:p>
+            <w:pPr>
+              <w:rPr>
+                <w:b/>
+                <w:bCs/>
+              </w:rPr>
+            </w:pPr>
             <w:r>
-              <w:t>Chatbot interface</w:t>
+              <w:rPr>
+                <w:b/>
+                <w:bCs/>
+              </w:rPr>
+              <w:t>Textual explanation API for each issue</w:t>
             </w:r>
           </w:p>
         </w:tc>
@@ -1667,53 +2125,85 @@
         </w:trPr>
         <w:tc>
           <w:tcPr>
-            <w:tcW w:w="0" w:type="auto"/>
-            <w:vAlign w:val="center"/>
-            <w:hideMark/>
+            <w:tcW w:w="850" w:type="dxa"/>
+            <w:vAlign w:val="center"/>
           </w:tcPr>
           <w:p>
+            <w:pPr>
+              <w:rPr>
+                <w:b/>
+                <w:bCs/>
+              </w:rPr>
+            </w:pPr>
             <w:r>
               <w:rPr>
                 <w:b/>
                 <w:bCs/>
               </w:rPr>
-              <w:t>Oct 12</w:t>
+              <w:t>13</w:t>
             </w:r>
           </w:p>
         </w:tc>
         <w:tc>
           <w:tcPr>
-            <w:tcW w:w="0" w:type="auto"/>
-            <w:vAlign w:val="center"/>
-            <w:hideMark/>
+            <w:tcW w:w="3500" w:type="dxa"/>
+            <w:vAlign w:val="center"/>
           </w:tcPr>
           <w:p>
+            <w:pPr>
+              <w:rPr>
+                <w:b/>
+                <w:bCs/>
+              </w:rPr>
+            </w:pPr>
             <w:r>
-              <w:t>Week 11</w:t>
+              <w:rPr>
+                <w:b/>
+                <w:bCs/>
+              </w:rPr>
+              <w:t>Integrate chatbot UI for Q&amp;A using NLP engine</w:t>
             </w:r>
           </w:p>
         </w:tc>
         <w:tc>
           <w:tcPr>
-            <w:tcW w:w="0" w:type="auto"/>
-            <w:vAlign w:val="center"/>
-            <w:hideMark/>
+            <w:tcW w:w="2470" w:type="dxa"/>
+            <w:vAlign w:val="center"/>
           </w:tcPr>
           <w:p>
+            <w:pPr>
+              <w:rPr>
+                <w:b/>
+                <w:bCs/>
+              </w:rPr>
+            </w:pPr>
             <w:r>
-              <w:t>Gamified Debugging Mode</w:t>
+              <w:rPr>
+                <w:b/>
+                <w:bCs/>
+              </w:rPr>
+              <w:t>Week 13 – Week 14</w:t>
             </w:r>
           </w:p>
         </w:tc>
         <w:tc>
           <w:tcPr>
-            <w:tcW w:w="0" w:type="auto"/>
-            <w:vAlign w:val="center"/>
-            <w:hideMark/>
+            <w:tcW w:w="2380" w:type="dxa"/>
+            <w:vAlign w:val="center"/>
           </w:tcPr>
           <w:p>
+            <w:pPr>
+              <w:rPr>
+                <w:b/>
+                <w:bCs/>
+              </w:rPr>
+            </w:pPr>
             <w:r>
-              <w:t>Debugging UI</w:t>
+              <w:rPr>
+                <w:b/>
+                <w:bCs/>
+              </w:rPr>
+              <w:t>Chatbot in UI answering risk-related queries</w:t>
             </w:r>
           </w:p>
         </w:tc>
@@ -1724,53 +2214,85 @@
         </w:trPr>
         <w:tc>
           <w:tcPr>
-            <w:tcW w:w="0" w:type="auto"/>
-            <w:vAlign w:val="center"/>
-            <w:hideMark/>
+            <w:tcW w:w="850" w:type="dxa"/>
+            <w:vAlign w:val="center"/>
           </w:tcPr>
           <w:p>
+            <w:pPr>
+              <w:rPr>
+                <w:b/>
+                <w:bCs/>
+              </w:rPr>
+            </w:pPr>
             <w:r>
               <w:rPr>
                 <w:b/>
                 <w:bCs/>
               </w:rPr>
-              <w:t>Oct 19</w:t>
+              <w:t>14</w:t>
             </w:r>
           </w:p>
         </w:tc>
         <w:tc>
           <w:tcPr>
-            <w:tcW w:w="0" w:type="auto"/>
-            <w:vAlign w:val="center"/>
-            <w:hideMark/>
+            <w:tcW w:w="3500" w:type="dxa"/>
+            <w:vAlign w:val="center"/>
           </w:tcPr>
           <w:p>
+            <w:pPr>
+              <w:rPr>
+                <w:b/>
+                <w:bCs/>
+              </w:rPr>
+            </w:pPr>
             <w:r>
-              <w:t>Week 12</w:t>
+              <w:rPr>
+                <w:b/>
+                <w:bCs/>
+              </w:rPr>
+              <w:t>Add gamified debugging UI for interactive issue fixing</w:t>
             </w:r>
           </w:p>
         </w:tc>
         <w:tc>
           <w:tcPr>
-            <w:tcW w:w="0" w:type="auto"/>
-            <w:vAlign w:val="center"/>
-            <w:hideMark/>
+            <w:tcW w:w="2470" w:type="dxa"/>
+            <w:vAlign w:val="center"/>
           </w:tcPr>
           <w:p>
+            <w:pPr>
+              <w:rPr>
+                <w:b/>
+                <w:bCs/>
+              </w:rPr>
+            </w:pPr>
             <w:r>
-              <w:t>Full integration testing</w:t>
+              <w:rPr>
+                <w:b/>
+                <w:bCs/>
+              </w:rPr>
+              <w:t>Week 14 – Week 15</w:t>
             </w:r>
           </w:p>
         </w:tc>
         <w:tc>
           <w:tcPr>
-            <w:tcW w:w="0" w:type="auto"/>
-            <w:vAlign w:val="center"/>
-            <w:hideMark/>
+            <w:tcW w:w="2380" w:type="dxa"/>
+            <w:vAlign w:val="center"/>
           </w:tcPr>
           <w:p>
+            <w:pPr>
+              <w:rPr>
+                <w:b/>
+                <w:bCs/>
+              </w:rPr>
+            </w:pPr>
             <w:r>
-              <w:t>Integrated platform</w:t>
+              <w:rPr>
+                <w:b/>
+                <w:bCs/>
+              </w:rPr>
+              <w:t>Fix-it mode with developer challenges</w:t>
             </w:r>
           </w:p>
         </w:tc>
@@ -1781,53 +2303,85 @@
         </w:trPr>
         <w:tc>
           <w:tcPr>
-            <w:tcW w:w="0" w:type="auto"/>
-            <w:vAlign w:val="center"/>
-            <w:hideMark/>
+            <w:tcW w:w="850" w:type="dxa"/>
+            <w:vAlign w:val="center"/>
           </w:tcPr>
           <w:p>
+            <w:pPr>
+              <w:rPr>
+                <w:b/>
+                <w:bCs/>
+              </w:rPr>
+            </w:pPr>
             <w:r>
               <w:rPr>
                 <w:b/>
                 <w:bCs/>
               </w:rPr>
-              <w:t>Oct 26</w:t>
+              <w:t>15</w:t>
             </w:r>
           </w:p>
         </w:tc>
         <w:tc>
           <w:tcPr>
-            <w:tcW w:w="0" w:type="auto"/>
-            <w:vAlign w:val="center"/>
-            <w:hideMark/>
+            <w:tcW w:w="3500" w:type="dxa"/>
+            <w:vAlign w:val="center"/>
           </w:tcPr>
           <w:p>
+            <w:pPr>
+              <w:rPr>
+                <w:b/>
+                <w:bCs/>
+              </w:rPr>
+            </w:pPr>
             <w:r>
-              <w:t>Week 13</w:t>
+              <w:rPr>
+                <w:b/>
+                <w:bCs/>
+              </w:rPr>
+              <w:t>Final integration &amp; feature polishing</w:t>
             </w:r>
           </w:p>
         </w:tc>
         <w:tc>
           <w:tcPr>
-            <w:tcW w:w="0" w:type="auto"/>
-            <w:vAlign w:val="center"/>
-            <w:hideMark/>
+            <w:tcW w:w="2470" w:type="dxa"/>
+            <w:vAlign w:val="center"/>
           </w:tcPr>
           <w:p>
+            <w:pPr>
+              <w:rPr>
+                <w:b/>
+                <w:bCs/>
+              </w:rPr>
+            </w:pPr>
             <w:r>
-              <w:t>Evaluate ML model vs release outcomes</w:t>
+              <w:rPr>
+                <w:b/>
+                <w:bCs/>
+              </w:rPr>
+              <w:t>Week 15 – Week 16</w:t>
             </w:r>
           </w:p>
         </w:tc>
         <w:tc>
           <w:tcPr>
-            <w:tcW w:w="0" w:type="auto"/>
-            <w:vAlign w:val="center"/>
-            <w:hideMark/>
+            <w:tcW w:w="2380" w:type="dxa"/>
+            <w:vAlign w:val="center"/>
           </w:tcPr>
           <w:p>
+            <w:pPr>
+              <w:rPr>
+                <w:b/>
+                <w:bCs/>
+              </w:rPr>
+            </w:pPr>
             <w:r>
-              <w:t>Risk evaluation report</w:t>
+              <w:rPr>
+                <w:b/>
+                <w:bCs/>
+              </w:rPr>
+              <w:t>Fully working unified platform</w:t>
             </w:r>
           </w:p>
         </w:tc>
@@ -1838,54 +2392,58 @@
         </w:trPr>
         <w:tc>
           <w:tcPr>
-            <w:tcW w:w="0" w:type="auto"/>
-            <w:vAlign w:val="center"/>
-            <w:hideMark/>
+            <w:tcW w:w="850" w:type="dxa"/>
+            <w:vAlign w:val="center"/>
           </w:tcPr>
           <w:p>
-            <w:r>
-              <w:rPr>
-                <w:b/>
-                <w:bCs/>
-              </w:rPr>
-              <w:t>Nov 2</w:t>
-            </w:r>
+            <w:pPr>
+              <w:rPr>
+                <w:b/>
+                <w:bCs/>
+              </w:rPr>
+            </w:pPr>
           </w:p>
         </w:tc>
         <w:tc>
           <w:tcPr>
-            <w:tcW w:w="0" w:type="auto"/>
-            <w:vAlign w:val="center"/>
-            <w:hideMark/>
+            <w:tcW w:w="3500" w:type="dxa"/>
+            <w:vAlign w:val="center"/>
           </w:tcPr>
           <w:p>
-            <w:r>
-              <w:t>Week 14</w:t>
-            </w:r>
+            <w:pPr>
+              <w:rPr>
+                <w:b/>
+                <w:bCs/>
+              </w:rPr>
+            </w:pPr>
           </w:p>
         </w:tc>
         <w:tc>
           <w:tcPr>
-            <w:tcW w:w="0" w:type="auto"/>
-            <w:vAlign w:val="center"/>
-            <w:hideMark/>
+            <w:tcW w:w="2470" w:type="dxa"/>
+            <w:vAlign w:val="center"/>
           </w:tcPr>
           <w:p>
-            <w:r>
-              <w:t>Research findings, document evaluation</w:t>
-            </w:r>
+            <w:pPr>
+              <w:rPr>
+                <w:b/>
+                <w:bCs/>
+              </w:rPr>
+            </w:pPr>
           </w:p>
         </w:tc>
         <w:tc>
           <w:tcPr>
-            <w:tcW w:w="0" w:type="auto"/>
-            <w:vAlign w:val="center"/>
-            <w:hideMark/>
+            <w:tcW w:w="2380" w:type="dxa"/>
+            <w:vAlign w:val="center"/>
           </w:tcPr>
           <w:p>
-            <w:r>
-              <w:t>Research draft</w:t>
-            </w:r>
+            <w:pPr>
+              <w:rPr>
+                <w:b/>
+                <w:bCs/>
+              </w:rPr>
+            </w:pPr>
           </w:p>
         </w:tc>
       </w:tr>
@@ -1895,56 +2453,31 @@
         </w:trPr>
         <w:tc>
           <w:tcPr>
-            <w:tcW w:w="0" w:type="auto"/>
-            <w:vAlign w:val="center"/>
-            <w:hideMark/>
-          </w:tcPr>
-          <w:p>
-            <w:r>
-              <w:rPr>
-                <w:b/>
-                <w:bCs/>
-              </w:rPr>
-              <w:lastRenderedPageBreak/>
-              <w:t>Nov 9</w:t>
-            </w:r>
-          </w:p>
-        </w:tc>
-        <w:tc>
-          <w:tcPr>
-            <w:tcW w:w="0" w:type="auto"/>
-            <w:vAlign w:val="center"/>
-            <w:hideMark/>
-          </w:tcPr>
-          <w:p>
-            <w:r>
-              <w:t>Week 15</w:t>
-            </w:r>
-          </w:p>
-        </w:tc>
-        <w:tc>
-          <w:tcPr>
-            <w:tcW w:w="0" w:type="auto"/>
-            <w:vAlign w:val="center"/>
-            <w:hideMark/>
-          </w:tcPr>
-          <w:p>
-            <w:r>
-              <w:t>Finalize project report &amp; supervisor review</w:t>
-            </w:r>
-          </w:p>
-        </w:tc>
-        <w:tc>
-          <w:tcPr>
-            <w:tcW w:w="0" w:type="auto"/>
-            <w:vAlign w:val="center"/>
-            <w:hideMark/>
-          </w:tcPr>
-          <w:p>
-            <w:r>
-              <w:t>Final report ready</w:t>
-            </w:r>
-          </w:p>
+            <w:tcW w:w="850" w:type="dxa"/>
+            <w:vAlign w:val="center"/>
+          </w:tcPr>
+          <w:p/>
+        </w:tc>
+        <w:tc>
+          <w:tcPr>
+            <w:tcW w:w="3500" w:type="dxa"/>
+            <w:vAlign w:val="center"/>
+          </w:tcPr>
+          <w:p/>
+        </w:tc>
+        <w:tc>
+          <w:tcPr>
+            <w:tcW w:w="2470" w:type="dxa"/>
+            <w:vAlign w:val="center"/>
+          </w:tcPr>
+          <w:p/>
+        </w:tc>
+        <w:tc>
+          <w:tcPr>
+            <w:tcW w:w="2380" w:type="dxa"/>
+            <w:vAlign w:val="center"/>
+          </w:tcPr>
+          <w:p/>
         </w:tc>
       </w:tr>
       <w:tr>
@@ -1953,55 +2486,31 @@
         </w:trPr>
         <w:tc>
           <w:tcPr>
-            <w:tcW w:w="0" w:type="auto"/>
-            <w:vAlign w:val="center"/>
-            <w:hideMark/>
-          </w:tcPr>
-          <w:p>
-            <w:r>
-              <w:rPr>
-                <w:b/>
-                <w:bCs/>
-              </w:rPr>
-              <w:t>Nov 11–12</w:t>
-            </w:r>
-          </w:p>
-        </w:tc>
-        <w:tc>
-          <w:tcPr>
-            <w:tcW w:w="0" w:type="auto"/>
-            <w:vAlign w:val="center"/>
-            <w:hideMark/>
-          </w:tcPr>
-          <w:p>
-            <w:r>
-              <w:t>—</w:t>
-            </w:r>
-          </w:p>
-        </w:tc>
-        <w:tc>
-          <w:tcPr>
-            <w:tcW w:w="0" w:type="auto"/>
-            <w:vAlign w:val="center"/>
-            <w:hideMark/>
-          </w:tcPr>
-          <w:p>
-            <w:r>
-              <w:t>Final Seminar &amp; Viva</w:t>
-            </w:r>
-          </w:p>
-        </w:tc>
-        <w:tc>
-          <w:tcPr>
-            <w:tcW w:w="0" w:type="auto"/>
-            <w:vAlign w:val="center"/>
-            <w:hideMark/>
-          </w:tcPr>
-          <w:p>
-            <w:r>
-              <w:t>Final presentation &amp; viva</w:t>
-            </w:r>
-          </w:p>
+            <w:tcW w:w="850" w:type="dxa"/>
+            <w:vAlign w:val="center"/>
+          </w:tcPr>
+          <w:p/>
+        </w:tc>
+        <w:tc>
+          <w:tcPr>
+            <w:tcW w:w="3500" w:type="dxa"/>
+            <w:vAlign w:val="center"/>
+          </w:tcPr>
+          <w:p/>
+        </w:tc>
+        <w:tc>
+          <w:tcPr>
+            <w:tcW w:w="2470" w:type="dxa"/>
+            <w:vAlign w:val="center"/>
+          </w:tcPr>
+          <w:p/>
+        </w:tc>
+        <w:tc>
+          <w:tcPr>
+            <w:tcW w:w="2380" w:type="dxa"/>
+            <w:vAlign w:val="center"/>
+          </w:tcPr>
+          <w:p/>
         </w:tc>
       </w:tr>
       <w:tr>
@@ -2010,62 +2519,566 @@
         </w:trPr>
         <w:tc>
           <w:tcPr>
-            <w:tcW w:w="0" w:type="auto"/>
-            <w:vAlign w:val="center"/>
-            <w:hideMark/>
-          </w:tcPr>
-          <w:p>
-            <w:r>
-              <w:rPr>
-                <w:b/>
-                <w:bCs/>
-              </w:rPr>
-              <w:t>Nov 13–15</w:t>
-            </w:r>
-          </w:p>
-        </w:tc>
-        <w:tc>
-          <w:tcPr>
-            <w:tcW w:w="0" w:type="auto"/>
-            <w:vAlign w:val="center"/>
-            <w:hideMark/>
-          </w:tcPr>
-          <w:p>
-            <w:r>
-              <w:t>Week 16</w:t>
-            </w:r>
-          </w:p>
-        </w:tc>
-        <w:tc>
-          <w:tcPr>
-            <w:tcW w:w="0" w:type="auto"/>
-            <w:vAlign w:val="center"/>
-            <w:hideMark/>
-          </w:tcPr>
-          <w:p>
-            <w:r>
-              <w:t>Upload final report + Turnitin check</w:t>
-            </w:r>
-          </w:p>
-        </w:tc>
-        <w:tc>
-          <w:tcPr>
-            <w:tcW w:w="0" w:type="auto"/>
-            <w:vAlign w:val="center"/>
-            <w:hideMark/>
-          </w:tcPr>
-          <w:p>
-            <w:r>
-              <w:t>Final submission</w:t>
-            </w:r>
-          </w:p>
+            <w:tcW w:w="850" w:type="dxa"/>
+            <w:vAlign w:val="center"/>
+          </w:tcPr>
+          <w:p/>
+        </w:tc>
+        <w:tc>
+          <w:tcPr>
+            <w:tcW w:w="3500" w:type="dxa"/>
+            <w:vAlign w:val="center"/>
+          </w:tcPr>
+          <w:p/>
+        </w:tc>
+        <w:tc>
+          <w:tcPr>
+            <w:tcW w:w="2470" w:type="dxa"/>
+            <w:vAlign w:val="center"/>
+          </w:tcPr>
+          <w:p/>
+        </w:tc>
+        <w:tc>
+          <w:tcPr>
+            <w:tcW w:w="2380" w:type="dxa"/>
+            <w:vAlign w:val="center"/>
+          </w:tcPr>
+          <w:p/>
+        </w:tc>
+      </w:tr>
+      <w:tr>
+        <w:trPr>
+          <w:tblCellSpacing w:w="15" w:type="dxa"/>
+        </w:trPr>
+        <w:tc>
+          <w:tcPr>
+            <w:tcW w:w="850" w:type="dxa"/>
+            <w:vAlign w:val="center"/>
+          </w:tcPr>
+          <w:p/>
+        </w:tc>
+        <w:tc>
+          <w:tcPr>
+            <w:tcW w:w="3500" w:type="dxa"/>
+            <w:vAlign w:val="center"/>
+          </w:tcPr>
+          <w:p/>
+        </w:tc>
+        <w:tc>
+          <w:tcPr>
+            <w:tcW w:w="2470" w:type="dxa"/>
+            <w:vAlign w:val="center"/>
+          </w:tcPr>
+          <w:p/>
+        </w:tc>
+        <w:tc>
+          <w:tcPr>
+            <w:tcW w:w="2380" w:type="dxa"/>
+            <w:vAlign w:val="center"/>
+          </w:tcPr>
+          <w:p/>
+        </w:tc>
+      </w:tr>
+      <w:tr>
+        <w:trPr>
+          <w:tblCellSpacing w:w="15" w:type="dxa"/>
+        </w:trPr>
+        <w:tc>
+          <w:tcPr>
+            <w:tcW w:w="850" w:type="dxa"/>
+            <w:vAlign w:val="center"/>
+          </w:tcPr>
+          <w:p/>
+        </w:tc>
+        <w:tc>
+          <w:tcPr>
+            <w:tcW w:w="3500" w:type="dxa"/>
+            <w:vAlign w:val="center"/>
+          </w:tcPr>
+          <w:p/>
+        </w:tc>
+        <w:tc>
+          <w:tcPr>
+            <w:tcW w:w="2470" w:type="dxa"/>
+            <w:vAlign w:val="center"/>
+          </w:tcPr>
+          <w:p/>
+        </w:tc>
+        <w:tc>
+          <w:tcPr>
+            <w:tcW w:w="2380" w:type="dxa"/>
+            <w:vAlign w:val="center"/>
+          </w:tcPr>
+          <w:p/>
+        </w:tc>
+      </w:tr>
+      <w:tr>
+        <w:trPr>
+          <w:tblCellSpacing w:w="15" w:type="dxa"/>
+        </w:trPr>
+        <w:tc>
+          <w:tcPr>
+            <w:tcW w:w="850" w:type="dxa"/>
+            <w:vAlign w:val="center"/>
+          </w:tcPr>
+          <w:p/>
+        </w:tc>
+        <w:tc>
+          <w:tcPr>
+            <w:tcW w:w="3500" w:type="dxa"/>
+            <w:vAlign w:val="center"/>
+          </w:tcPr>
+          <w:p/>
+        </w:tc>
+        <w:tc>
+          <w:tcPr>
+            <w:tcW w:w="2470" w:type="dxa"/>
+            <w:vAlign w:val="center"/>
+          </w:tcPr>
+          <w:p/>
+        </w:tc>
+        <w:tc>
+          <w:tcPr>
+            <w:tcW w:w="2380" w:type="dxa"/>
+            <w:vAlign w:val="center"/>
+          </w:tcPr>
+          <w:p/>
+        </w:tc>
+      </w:tr>
+      <w:tr>
+        <w:trPr>
+          <w:tblCellSpacing w:w="15" w:type="dxa"/>
+        </w:trPr>
+        <w:tc>
+          <w:tcPr>
+            <w:tcW w:w="850" w:type="dxa"/>
+            <w:vAlign w:val="center"/>
+          </w:tcPr>
+          <w:p/>
+        </w:tc>
+        <w:tc>
+          <w:tcPr>
+            <w:tcW w:w="3500" w:type="dxa"/>
+            <w:vAlign w:val="center"/>
+          </w:tcPr>
+          <w:p/>
+        </w:tc>
+        <w:tc>
+          <w:tcPr>
+            <w:tcW w:w="2470" w:type="dxa"/>
+            <w:vAlign w:val="center"/>
+          </w:tcPr>
+          <w:p/>
+        </w:tc>
+        <w:tc>
+          <w:tcPr>
+            <w:tcW w:w="2380" w:type="dxa"/>
+            <w:vAlign w:val="center"/>
+          </w:tcPr>
+          <w:p/>
+        </w:tc>
+      </w:tr>
+      <w:tr>
+        <w:trPr>
+          <w:tblCellSpacing w:w="15" w:type="dxa"/>
+        </w:trPr>
+        <w:tc>
+          <w:tcPr>
+            <w:tcW w:w="850" w:type="dxa"/>
+            <w:vAlign w:val="center"/>
+          </w:tcPr>
+          <w:p/>
+        </w:tc>
+        <w:tc>
+          <w:tcPr>
+            <w:tcW w:w="3500" w:type="dxa"/>
+            <w:vAlign w:val="center"/>
+          </w:tcPr>
+          <w:p/>
+        </w:tc>
+        <w:tc>
+          <w:tcPr>
+            <w:tcW w:w="2470" w:type="dxa"/>
+            <w:vAlign w:val="center"/>
+          </w:tcPr>
+          <w:p/>
+        </w:tc>
+        <w:tc>
+          <w:tcPr>
+            <w:tcW w:w="2380" w:type="dxa"/>
+            <w:vAlign w:val="center"/>
+          </w:tcPr>
+          <w:p/>
+        </w:tc>
+      </w:tr>
+      <w:tr>
+        <w:trPr>
+          <w:tblCellSpacing w:w="15" w:type="dxa"/>
+        </w:trPr>
+        <w:tc>
+          <w:tcPr>
+            <w:tcW w:w="850" w:type="dxa"/>
+            <w:vAlign w:val="center"/>
+          </w:tcPr>
+          <w:p/>
+        </w:tc>
+        <w:tc>
+          <w:tcPr>
+            <w:tcW w:w="3500" w:type="dxa"/>
+            <w:vAlign w:val="center"/>
+          </w:tcPr>
+          <w:p/>
+        </w:tc>
+        <w:tc>
+          <w:tcPr>
+            <w:tcW w:w="2470" w:type="dxa"/>
+            <w:vAlign w:val="center"/>
+          </w:tcPr>
+          <w:p/>
+        </w:tc>
+        <w:tc>
+          <w:tcPr>
+            <w:tcW w:w="2380" w:type="dxa"/>
+            <w:vAlign w:val="center"/>
+          </w:tcPr>
+          <w:p/>
+        </w:tc>
+      </w:tr>
+      <w:tr>
+        <w:trPr>
+          <w:tblCellSpacing w:w="15" w:type="dxa"/>
+        </w:trPr>
+        <w:tc>
+          <w:tcPr>
+            <w:tcW w:w="850" w:type="dxa"/>
+            <w:vAlign w:val="center"/>
+          </w:tcPr>
+          <w:p/>
+        </w:tc>
+        <w:tc>
+          <w:tcPr>
+            <w:tcW w:w="3500" w:type="dxa"/>
+            <w:vAlign w:val="center"/>
+          </w:tcPr>
+          <w:p/>
+        </w:tc>
+        <w:tc>
+          <w:tcPr>
+            <w:tcW w:w="2470" w:type="dxa"/>
+            <w:vAlign w:val="center"/>
+          </w:tcPr>
+          <w:p/>
+        </w:tc>
+        <w:tc>
+          <w:tcPr>
+            <w:tcW w:w="2380" w:type="dxa"/>
+            <w:vAlign w:val="center"/>
+          </w:tcPr>
+          <w:p/>
+        </w:tc>
+      </w:tr>
+      <w:tr>
+        <w:trPr>
+          <w:tblCellSpacing w:w="15" w:type="dxa"/>
+        </w:trPr>
+        <w:tc>
+          <w:tcPr>
+            <w:tcW w:w="850" w:type="dxa"/>
+            <w:vAlign w:val="center"/>
+          </w:tcPr>
+          <w:p/>
+        </w:tc>
+        <w:tc>
+          <w:tcPr>
+            <w:tcW w:w="3500" w:type="dxa"/>
+            <w:vAlign w:val="center"/>
+          </w:tcPr>
+          <w:p/>
+        </w:tc>
+        <w:tc>
+          <w:tcPr>
+            <w:tcW w:w="2470" w:type="dxa"/>
+            <w:vAlign w:val="center"/>
+          </w:tcPr>
+          <w:p/>
+        </w:tc>
+        <w:tc>
+          <w:tcPr>
+            <w:tcW w:w="2380" w:type="dxa"/>
+            <w:vAlign w:val="center"/>
+          </w:tcPr>
+          <w:p/>
+        </w:tc>
+      </w:tr>
+      <w:tr>
+        <w:trPr>
+          <w:tblCellSpacing w:w="15" w:type="dxa"/>
+        </w:trPr>
+        <w:tc>
+          <w:tcPr>
+            <w:tcW w:w="850" w:type="dxa"/>
+            <w:vAlign w:val="center"/>
+          </w:tcPr>
+          <w:p/>
+        </w:tc>
+        <w:tc>
+          <w:tcPr>
+            <w:tcW w:w="3500" w:type="dxa"/>
+            <w:vAlign w:val="center"/>
+          </w:tcPr>
+          <w:p/>
+        </w:tc>
+        <w:tc>
+          <w:tcPr>
+            <w:tcW w:w="2470" w:type="dxa"/>
+            <w:vAlign w:val="center"/>
+          </w:tcPr>
+          <w:p/>
+        </w:tc>
+        <w:tc>
+          <w:tcPr>
+            <w:tcW w:w="2380" w:type="dxa"/>
+            <w:vAlign w:val="center"/>
+          </w:tcPr>
+          <w:p/>
+        </w:tc>
+      </w:tr>
+      <w:tr>
+        <w:trPr>
+          <w:tblCellSpacing w:w="15" w:type="dxa"/>
+        </w:trPr>
+        <w:tc>
+          <w:tcPr>
+            <w:tcW w:w="850" w:type="dxa"/>
+            <w:vAlign w:val="center"/>
+          </w:tcPr>
+          <w:p/>
+        </w:tc>
+        <w:tc>
+          <w:tcPr>
+            <w:tcW w:w="3500" w:type="dxa"/>
+            <w:vAlign w:val="center"/>
+          </w:tcPr>
+          <w:p/>
+        </w:tc>
+        <w:tc>
+          <w:tcPr>
+            <w:tcW w:w="2470" w:type="dxa"/>
+            <w:vAlign w:val="center"/>
+          </w:tcPr>
+          <w:p/>
+        </w:tc>
+        <w:tc>
+          <w:tcPr>
+            <w:tcW w:w="2380" w:type="dxa"/>
+            <w:vAlign w:val="center"/>
+          </w:tcPr>
+          <w:p/>
+        </w:tc>
+      </w:tr>
+      <w:tr>
+        <w:trPr>
+          <w:tblCellSpacing w:w="15" w:type="dxa"/>
+        </w:trPr>
+        <w:tc>
+          <w:tcPr>
+            <w:tcW w:w="850" w:type="dxa"/>
+            <w:vAlign w:val="center"/>
+          </w:tcPr>
+          <w:p/>
+        </w:tc>
+        <w:tc>
+          <w:tcPr>
+            <w:tcW w:w="3500" w:type="dxa"/>
+            <w:vAlign w:val="center"/>
+          </w:tcPr>
+          <w:p/>
+        </w:tc>
+        <w:tc>
+          <w:tcPr>
+            <w:tcW w:w="2470" w:type="dxa"/>
+            <w:vAlign w:val="center"/>
+          </w:tcPr>
+          <w:p/>
+        </w:tc>
+        <w:tc>
+          <w:tcPr>
+            <w:tcW w:w="2380" w:type="dxa"/>
+            <w:vAlign w:val="center"/>
+          </w:tcPr>
+          <w:p/>
+        </w:tc>
+      </w:tr>
+      <w:tr>
+        <w:trPr>
+          <w:tblCellSpacing w:w="15" w:type="dxa"/>
+        </w:trPr>
+        <w:tc>
+          <w:tcPr>
+            <w:tcW w:w="850" w:type="dxa"/>
+            <w:vAlign w:val="center"/>
+          </w:tcPr>
+          <w:p/>
+        </w:tc>
+        <w:tc>
+          <w:tcPr>
+            <w:tcW w:w="3500" w:type="dxa"/>
+            <w:vAlign w:val="center"/>
+          </w:tcPr>
+          <w:p/>
+        </w:tc>
+        <w:tc>
+          <w:tcPr>
+            <w:tcW w:w="2470" w:type="dxa"/>
+            <w:vAlign w:val="center"/>
+          </w:tcPr>
+          <w:p/>
+        </w:tc>
+        <w:tc>
+          <w:tcPr>
+            <w:tcW w:w="2380" w:type="dxa"/>
+            <w:vAlign w:val="center"/>
+          </w:tcPr>
+          <w:p/>
+        </w:tc>
+      </w:tr>
+      <w:tr>
+        <w:trPr>
+          <w:tblCellSpacing w:w="15" w:type="dxa"/>
+        </w:trPr>
+        <w:tc>
+          <w:tcPr>
+            <w:tcW w:w="850" w:type="dxa"/>
+            <w:vAlign w:val="center"/>
+          </w:tcPr>
+          <w:p/>
+        </w:tc>
+        <w:tc>
+          <w:tcPr>
+            <w:tcW w:w="3500" w:type="dxa"/>
+            <w:vAlign w:val="center"/>
+          </w:tcPr>
+          <w:p/>
+        </w:tc>
+        <w:tc>
+          <w:tcPr>
+            <w:tcW w:w="2470" w:type="dxa"/>
+            <w:vAlign w:val="center"/>
+          </w:tcPr>
+          <w:p/>
+        </w:tc>
+        <w:tc>
+          <w:tcPr>
+            <w:tcW w:w="2380" w:type="dxa"/>
+            <w:vAlign w:val="center"/>
+          </w:tcPr>
+          <w:p/>
+        </w:tc>
+      </w:tr>
+      <w:tr>
+        <w:trPr>
+          <w:tblCellSpacing w:w="15" w:type="dxa"/>
+        </w:trPr>
+        <w:tc>
+          <w:tcPr>
+            <w:tcW w:w="850" w:type="dxa"/>
+            <w:vAlign w:val="center"/>
+          </w:tcPr>
+          <w:p/>
+        </w:tc>
+        <w:tc>
+          <w:tcPr>
+            <w:tcW w:w="3500" w:type="dxa"/>
+            <w:vAlign w:val="center"/>
+          </w:tcPr>
+          <w:p/>
+        </w:tc>
+        <w:tc>
+          <w:tcPr>
+            <w:tcW w:w="2470" w:type="dxa"/>
+            <w:vAlign w:val="center"/>
+          </w:tcPr>
+          <w:p/>
+        </w:tc>
+        <w:tc>
+          <w:tcPr>
+            <w:tcW w:w="2380" w:type="dxa"/>
+            <w:vAlign w:val="center"/>
+          </w:tcPr>
+          <w:p/>
+        </w:tc>
+      </w:tr>
+      <w:tr>
+        <w:trPr>
+          <w:tblCellSpacing w:w="15" w:type="dxa"/>
+        </w:trPr>
+        <w:tc>
+          <w:tcPr>
+            <w:tcW w:w="850" w:type="dxa"/>
+            <w:vAlign w:val="center"/>
+          </w:tcPr>
+          <w:p/>
+        </w:tc>
+        <w:tc>
+          <w:tcPr>
+            <w:tcW w:w="3500" w:type="dxa"/>
+            <w:vAlign w:val="center"/>
+          </w:tcPr>
+          <w:p/>
+        </w:tc>
+        <w:tc>
+          <w:tcPr>
+            <w:tcW w:w="2470" w:type="dxa"/>
+            <w:vAlign w:val="center"/>
+          </w:tcPr>
+          <w:p/>
+        </w:tc>
+        <w:tc>
+          <w:tcPr>
+            <w:tcW w:w="2380" w:type="dxa"/>
+            <w:vAlign w:val="center"/>
+          </w:tcPr>
+          <w:p/>
+        </w:tc>
+      </w:tr>
+      <w:tr>
+        <w:trPr>
+          <w:tblCellSpacing w:w="15" w:type="dxa"/>
+        </w:trPr>
+        <w:tc>
+          <w:tcPr>
+            <w:tcW w:w="850" w:type="dxa"/>
+            <w:vAlign w:val="center"/>
+          </w:tcPr>
+          <w:p/>
+        </w:tc>
+        <w:tc>
+          <w:tcPr>
+            <w:tcW w:w="3500" w:type="dxa"/>
+            <w:vAlign w:val="center"/>
+          </w:tcPr>
+          <w:p/>
+        </w:tc>
+        <w:tc>
+          <w:tcPr>
+            <w:tcW w:w="2470" w:type="dxa"/>
+            <w:vAlign w:val="center"/>
+          </w:tcPr>
+          <w:p/>
+        </w:tc>
+        <w:tc>
+          <w:tcPr>
+            <w:tcW w:w="2380" w:type="dxa"/>
+            <w:vAlign w:val="center"/>
+          </w:tcPr>
+          <w:p/>
         </w:tc>
       </w:tr>
     </w:tbl>
     <w:p>
       <w:r>
         <w:pict w14:anchorId="5BCA0CCD">
-          <v:rect id="_x0000_i1092" style="width:0;height:1.5pt" o:hralign="center" o:hrstd="t" o:hr="t" fillcolor="#a0a0a0" stroked="f"/>
+          <v:rect id="_x0000_i1032" style="width:0;height:1.5pt" o:hralign="center" o:hrstd="t" o:hr="t" fillcolor="#a0a0a0" stroked="f"/>
         </w:pict>
       </w:r>
     </w:p>
@@ -2121,7 +3134,7 @@
     <w:p>
       <w:r>
         <w:pict w14:anchorId="7159F175">
-          <v:rect id="_x0000_i1093" style="width:0;height:1.5pt" o:hralign="center" o:hrstd="t" o:hr="t" fillcolor="#a0a0a0" stroked="f"/>
+          <v:rect id="_x0000_i1033" style="width:0;height:1.5pt" o:hralign="center" o:hrstd="t" o:hr="t" fillcolor="#a0a0a0" stroked="f"/>
         </w:pict>
       </w:r>
     </w:p>
@@ -2206,7 +3219,7 @@
     <w:p>
       <w:r>
         <w:pict w14:anchorId="2290FF4E">
-          <v:rect id="_x0000_i1094" style="width:0;height:1.5pt" o:hralign="center" o:hrstd="t" o:hr="t" fillcolor="#a0a0a0" stroked="f"/>
+          <v:rect id="_x0000_i1034" style="width:0;height:1.5pt" o:hralign="center" o:hrstd="t" o:hr="t" fillcolor="#a0a0a0" stroked="f"/>
         </w:pict>
       </w:r>
     </w:p>
@@ -2223,7 +3236,6 @@
           <w:b/>
           <w:bCs/>
         </w:rPr>
-        <w:lastRenderedPageBreak/>
         <w:t>✅</w:t>
       </w:r>
       <w:r>
@@ -2602,6 +3614,7 @@
     </w:p>
     <w:p>
       <w:r>
+        <w:lastRenderedPageBreak/>
         <w:t xml:space="preserve">│   └── </w:t>
       </w:r>
       <w:proofErr w:type="gramStart"/>
@@ -2676,9 +3689,405 @@
     <w:p>
       <w:proofErr w:type="gramStart"/>
       <w:r>
+        <w:t xml:space="preserve">│   │   </w:t>
+      </w:r>
+      <w:r>
+        <w:rPr>
+          <w:rFonts w:ascii="MS Gothic" w:eastAsia="MS Gothic" w:hAnsi="MS Gothic" w:cs="MS Gothic" w:hint="eastAsia"/>
+        </w:rPr>
+        <w:t>├</w:t>
+      </w:r>
+      <w:r>
+        <w:rPr>
+          <w:rFonts w:ascii="Aptos" w:hAnsi="Aptos" w:cs="Aptos"/>
+        </w:rPr>
+        <w:t>──</w:t>
+      </w:r>
+      <w:r>
+        <w:t xml:space="preserve"> controller/        #</w:t>
+      </w:r>
+      <w:proofErr w:type="gramEnd"/>
+      <w:r>
+        <w:t xml:space="preserve"> REST endpoints (Code Analysis, Risk Scoring)</w:t>
+      </w:r>
+    </w:p>
+    <w:p>
+      <w:proofErr w:type="gramStart"/>
+      <w:r>
+        <w:t xml:space="preserve">│   │   </w:t>
+      </w:r>
+      <w:r>
+        <w:rPr>
+          <w:rFonts w:ascii="MS Gothic" w:eastAsia="MS Gothic" w:hAnsi="MS Gothic" w:cs="MS Gothic" w:hint="eastAsia"/>
+        </w:rPr>
+        <w:t>├</w:t>
+      </w:r>
+      <w:r>
+        <w:rPr>
+          <w:rFonts w:ascii="Aptos" w:hAnsi="Aptos" w:cs="Aptos"/>
+        </w:rPr>
+        <w:t>──</w:t>
+      </w:r>
+      <w:r>
+        <w:t xml:space="preserve"> service/           #</w:t>
+      </w:r>
+      <w:proofErr w:type="gramEnd"/>
+      <w:r>
+        <w:t xml:space="preserve"> Orchestrates core services &amp; Python ML</w:t>
+      </w:r>
+    </w:p>
+    <w:p>
+      <w:proofErr w:type="gramStart"/>
+      <w:r>
+        <w:t xml:space="preserve">│   │   </w:t>
+      </w:r>
+      <w:r>
+        <w:rPr>
+          <w:rFonts w:ascii="MS Gothic" w:eastAsia="MS Gothic" w:hAnsi="MS Gothic" w:cs="MS Gothic" w:hint="eastAsia"/>
+        </w:rPr>
+        <w:t>├</w:t>
+      </w:r>
+      <w:r>
+        <w:rPr>
+          <w:rFonts w:ascii="Aptos" w:hAnsi="Aptos" w:cs="Aptos"/>
+        </w:rPr>
+        <w:t>──</w:t>
+      </w:r>
+      <w:r>
+        <w:t xml:space="preserve"> model/             #</w:t>
+      </w:r>
+      <w:proofErr w:type="gramEnd"/>
+      <w:r>
+        <w:t xml:space="preserve"> DTOs for repo data, vulnerabilities</w:t>
+      </w:r>
+    </w:p>
+    <w:p>
+      <w:r>
+        <w:t>│   │   └── config/            # CORS, Swagger, etc.</w:t>
+      </w:r>
+    </w:p>
+    <w:p>
+      <w:r>
+        <w:t xml:space="preserve">│   </w:t>
+      </w:r>
+      <w:r>
+        <w:rPr>
+          <w:rFonts w:ascii="MS Gothic" w:eastAsia="MS Gothic" w:hAnsi="MS Gothic" w:cs="MS Gothic" w:hint="eastAsia"/>
+        </w:rPr>
+        <w:t>├</w:t>
+      </w:r>
+      <w:r>
+        <w:rPr>
+          <w:rFonts w:ascii="Aptos" w:hAnsi="Aptos" w:cs="Aptos"/>
+        </w:rPr>
+        <w:t>──</w:t>
+      </w:r>
+      <w:r>
+        <w:t xml:space="preserve"> </w:t>
+      </w:r>
+      <w:proofErr w:type="spellStart"/>
+      <w:r>
+        <w:t>src</w:t>
+      </w:r>
+      <w:proofErr w:type="spellEnd"/>
+      <w:r>
+        <w:t>/main/resources/</w:t>
+      </w:r>
+    </w:p>
+    <w:p>
+      <w:r>
+        <w:t xml:space="preserve">│   │   └── </w:t>
+      </w:r>
+      <w:proofErr w:type="spellStart"/>
+      <w:r>
+        <w:t>application.yml</w:t>
+      </w:r>
+      <w:proofErr w:type="spellEnd"/>
+      <w:r>
+        <w:t xml:space="preserve">    # DB configs</w:t>
+      </w:r>
+    </w:p>
+    <w:p>
+      <w:r>
+        <w:t xml:space="preserve">│   </w:t>
+      </w:r>
+      <w:r>
+        <w:rPr>
+          <w:rFonts w:ascii="MS Gothic" w:eastAsia="MS Gothic" w:hAnsi="MS Gothic" w:cs="MS Gothic" w:hint="eastAsia"/>
+        </w:rPr>
+        <w:t>├</w:t>
+      </w:r>
+      <w:r>
+        <w:rPr>
+          <w:rFonts w:ascii="Aptos" w:hAnsi="Aptos" w:cs="Aptos"/>
+        </w:rPr>
+        <w:t>──</w:t>
+      </w:r>
+      <w:r>
+        <w:t xml:space="preserve"> pom.xml                # Maven dependencies</w:t>
+      </w:r>
+    </w:p>
+    <w:p>
+      <w:r>
+        <w:t xml:space="preserve">│   └── </w:t>
+      </w:r>
+      <w:proofErr w:type="spellStart"/>
+      <w:r>
+        <w:t>Dockerfile</w:t>
+      </w:r>
+      <w:proofErr w:type="spellEnd"/>
+    </w:p>
+    <w:p>
+      <w:r>
+        <w:t>│</w:t>
+      </w:r>
+    </w:p>
+    <w:p>
+      <w:r>
+        <w:rPr>
+          <w:rFonts w:ascii="MS Gothic" w:eastAsia="MS Gothic" w:hAnsi="MS Gothic" w:cs="MS Gothic" w:hint="eastAsia"/>
+        </w:rPr>
+        <w:t>├</w:t>
+      </w:r>
+      <w:r>
+        <w:rPr>
+          <w:rFonts w:ascii="Aptos" w:hAnsi="Aptos" w:cs="Aptos"/>
+        </w:rPr>
+        <w:t>──</w:t>
+      </w:r>
+      <w:r>
+        <w:t xml:space="preserve"> ai-ml-</w:t>
+      </w:r>
+      <w:proofErr w:type="gramStart"/>
+      <w:r>
+        <w:t>services/            #</w:t>
+      </w:r>
+      <w:proofErr w:type="gramEnd"/>
+      <w:r>
+        <w:t xml:space="preserve"> Python AI layer</w:t>
+      </w:r>
+    </w:p>
+    <w:p>
+      <w:r>
+        <w:t xml:space="preserve">│   </w:t>
+      </w:r>
+      <w:r>
+        <w:rPr>
+          <w:rFonts w:ascii="MS Gothic" w:eastAsia="MS Gothic" w:hAnsi="MS Gothic" w:cs="MS Gothic" w:hint="eastAsia"/>
+        </w:rPr>
+        <w:t>├</w:t>
+      </w:r>
+      <w:r>
+        <w:rPr>
+          <w:rFonts w:ascii="Aptos" w:hAnsi="Aptos" w:cs="Aptos"/>
+        </w:rPr>
+        <w:t>──</w:t>
+      </w:r>
+      <w:r>
+        <w:t xml:space="preserve"> </w:t>
+      </w:r>
+      <w:proofErr w:type="spellStart"/>
+      <w:r>
+        <w:t>risk_model</w:t>
+      </w:r>
+      <w:proofErr w:type="spellEnd"/>
+      <w:r>
+        <w:t>/</w:t>
+      </w:r>
+    </w:p>
+    <w:p>
+      <w:r>
+        <w:t xml:space="preserve">│   │   </w:t>
+      </w:r>
+      <w:r>
+        <w:rPr>
+          <w:rFonts w:ascii="MS Gothic" w:eastAsia="MS Gothic" w:hAnsi="MS Gothic" w:cs="MS Gothic" w:hint="eastAsia"/>
+        </w:rPr>
+        <w:t>├</w:t>
+      </w:r>
+      <w:r>
+        <w:rPr>
+          <w:rFonts w:ascii="Aptos" w:hAnsi="Aptos" w:cs="Aptos"/>
+        </w:rPr>
+        <w:t>──</w:t>
+      </w:r>
+      <w:r>
+        <w:t xml:space="preserve"> train_model.py     # ML model for release risk prediction</w:t>
+      </w:r>
+    </w:p>
+    <w:p>
+      <w:r>
+        <w:t xml:space="preserve">│   │   </w:t>
+      </w:r>
+      <w:r>
+        <w:rPr>
+          <w:rFonts w:ascii="MS Gothic" w:eastAsia="MS Gothic" w:hAnsi="MS Gothic" w:cs="MS Gothic" w:hint="eastAsia"/>
+        </w:rPr>
+        <w:t>├</w:t>
+      </w:r>
+      <w:r>
+        <w:rPr>
+          <w:rFonts w:ascii="Aptos" w:hAnsi="Aptos" w:cs="Aptos"/>
+        </w:rPr>
+        <w:t>──</w:t>
+      </w:r>
+      <w:r>
+        <w:t xml:space="preserve"> </w:t>
+      </w:r>
+      <w:proofErr w:type="gramStart"/>
+      <w:r>
+        <w:t>risk_predictor.py  #</w:t>
+      </w:r>
+      <w:proofErr w:type="gramEnd"/>
+      <w:r>
+        <w:t xml:space="preserve"> API for scoring risks</w:t>
+      </w:r>
+    </w:p>
+    <w:p>
+      <w:r>
+        <w:t>│   │   └── requirements.txt</w:t>
+      </w:r>
+    </w:p>
+    <w:p>
+      <w:r>
+        <w:t xml:space="preserve">│   </w:t>
+      </w:r>
+      <w:r>
+        <w:rPr>
+          <w:rFonts w:ascii="MS Gothic" w:eastAsia="MS Gothic" w:hAnsi="MS Gothic" w:cs="MS Gothic" w:hint="eastAsia"/>
+        </w:rPr>
+        <w:t>├</w:t>
+      </w:r>
+      <w:r>
+        <w:rPr>
+          <w:rFonts w:ascii="Aptos" w:hAnsi="Aptos" w:cs="Aptos"/>
+        </w:rPr>
+        <w:t>──</w:t>
+      </w:r>
+      <w:r>
+        <w:t xml:space="preserve"> </w:t>
+      </w:r>
+      <w:proofErr w:type="spellStart"/>
+      <w:r>
+        <w:t>nlp_explainer</w:t>
+      </w:r>
+      <w:proofErr w:type="spellEnd"/>
+      <w:r>
+        <w:t>/</w:t>
+      </w:r>
+    </w:p>
+    <w:p>
+      <w:r>
+        <w:t xml:space="preserve">│   │   </w:t>
+      </w:r>
+      <w:r>
+        <w:rPr>
+          <w:rFonts w:ascii="MS Gothic" w:eastAsia="MS Gothic" w:hAnsi="MS Gothic" w:cs="MS Gothic" w:hint="eastAsia"/>
+        </w:rPr>
+        <w:t>├</w:t>
+      </w:r>
+      <w:r>
+        <w:rPr>
+          <w:rFonts w:ascii="Aptos" w:hAnsi="Aptos" w:cs="Aptos"/>
+        </w:rPr>
+        <w:t>──</w:t>
+      </w:r>
+      <w:r>
+        <w:t xml:space="preserve"> explain_issue.py   # NLP-based issue summaries</w:t>
+      </w:r>
+    </w:p>
+    <w:p>
+      <w:r>
+        <w:t>│   │   └── alternative_suggester.py</w:t>
+      </w:r>
+    </w:p>
+    <w:p>
+      <w:r>
+        <w:t xml:space="preserve">│   </w:t>
+      </w:r>
+      <w:r>
+        <w:rPr>
+          <w:rFonts w:ascii="MS Gothic" w:eastAsia="MS Gothic" w:hAnsi="MS Gothic" w:cs="MS Gothic" w:hint="eastAsia"/>
+        </w:rPr>
+        <w:t>├</w:t>
+      </w:r>
+      <w:r>
+        <w:rPr>
+          <w:rFonts w:ascii="Aptos" w:hAnsi="Aptos" w:cs="Aptos"/>
+        </w:rPr>
+        <w:t>──</w:t>
+      </w:r>
+      <w:r>
+        <w:t xml:space="preserve"> </w:t>
+      </w:r>
+      <w:proofErr w:type="spellStart"/>
+      <w:r>
+        <w:t>knowledge_graph</w:t>
+      </w:r>
+      <w:proofErr w:type="spellEnd"/>
+      <w:r>
+        <w:t>/</w:t>
+      </w:r>
+    </w:p>
+    <w:p>
+      <w:r>
+        <w:t>│   │   └── build_graph.py     # Entity extraction + graph relationships</w:t>
+      </w:r>
+    </w:p>
+    <w:p>
+      <w:r>
+        <w:t xml:space="preserve">│   </w:t>
+      </w:r>
+      <w:r>
+        <w:rPr>
+          <w:rFonts w:ascii="MS Gothic" w:eastAsia="MS Gothic" w:hAnsi="MS Gothic" w:cs="MS Gothic" w:hint="eastAsia"/>
+        </w:rPr>
+        <w:t>├</w:t>
+      </w:r>
+      <w:r>
+        <w:rPr>
+          <w:rFonts w:ascii="Aptos" w:hAnsi="Aptos" w:cs="Aptos"/>
+        </w:rPr>
+        <w:t>──</w:t>
+      </w:r>
+      <w:r>
+        <w:t xml:space="preserve"> </w:t>
+      </w:r>
+      <w:proofErr w:type="spellStart"/>
+      <w:r>
+        <w:t>security_scanner</w:t>
+      </w:r>
+      <w:proofErr w:type="spellEnd"/>
+      <w:r>
+        <w:t>/</w:t>
+      </w:r>
+    </w:p>
+    <w:p>
+      <w:r>
+        <w:t>│   │   └── vulnerability_check.py # Uses NVD/</w:t>
+      </w:r>
+      <w:proofErr w:type="spellStart"/>
+      <w:r>
+        <w:t>OSSIndex</w:t>
+      </w:r>
+      <w:proofErr w:type="spellEnd"/>
+      <w:r>
+        <w:t xml:space="preserve"> APIs</w:t>
+      </w:r>
+    </w:p>
+    <w:p>
+      <w:r>
         <w:lastRenderedPageBreak/>
-        <w:t xml:space="preserve">│   │   </w:t>
-      </w:r>
+        <w:t>│   └── fastapi_app.py         # Exposes ML/NLP services as APIs</w:t>
+      </w:r>
+    </w:p>
+    <w:p>
+      <w:r>
+        <w:t>│</w:t>
+      </w:r>
+    </w:p>
+    <w:p>
+      <w:proofErr w:type="gramStart"/>
       <w:r>
         <w:rPr>
           <w:rFonts w:ascii="MS Gothic" w:eastAsia="MS Gothic" w:hAnsi="MS Gothic" w:cs="MS Gothic" w:hint="eastAsia"/>
@@ -2692,448 +4101,51 @@
         <w:t>──</w:t>
       </w:r>
       <w:r>
-        <w:t xml:space="preserve"> controller/        #</w:t>
+        <w:t xml:space="preserve"> data/                      #</w:t>
       </w:r>
       <w:proofErr w:type="gramEnd"/>
       <w:r>
-        <w:t xml:space="preserve"> REST endpoints (Code Analysis, Risk Scoring)</w:t>
-      </w:r>
-    </w:p>
-    <w:p>
+        <w:t xml:space="preserve"> Collected data &amp; DB scripts</w:t>
+      </w:r>
+    </w:p>
+    <w:p>
+      <w:r>
+        <w:t xml:space="preserve">│   </w:t>
+      </w:r>
+      <w:r>
+        <w:rPr>
+          <w:rFonts w:ascii="MS Gothic" w:eastAsia="MS Gothic" w:hAnsi="MS Gothic" w:cs="MS Gothic" w:hint="eastAsia"/>
+        </w:rPr>
+        <w:t>├</w:t>
+      </w:r>
+      <w:r>
+        <w:rPr>
+          <w:rFonts w:ascii="Aptos" w:hAnsi="Aptos" w:cs="Aptos"/>
+        </w:rPr>
+        <w:t>──</w:t>
+      </w:r>
+      <w:r>
+        <w:t xml:space="preserve"> </w:t>
+      </w:r>
+      <w:proofErr w:type="spellStart"/>
+      <w:r>
+        <w:t>sample_</w:t>
+      </w:r>
       <w:proofErr w:type="gramStart"/>
       <w:r>
-        <w:t xml:space="preserve">│   │   </w:t>
-      </w:r>
-      <w:r>
-        <w:rPr>
-          <w:rFonts w:ascii="MS Gothic" w:eastAsia="MS Gothic" w:hAnsi="MS Gothic" w:cs="MS Gothic" w:hint="eastAsia"/>
-        </w:rPr>
-        <w:t>├</w:t>
-      </w:r>
-      <w:r>
-        <w:rPr>
-          <w:rFonts w:ascii="Aptos" w:hAnsi="Aptos" w:cs="Aptos"/>
-        </w:rPr>
-        <w:t>──</w:t>
-      </w:r>
-      <w:r>
-        <w:t xml:space="preserve"> service/           #</w:t>
+        <w:t>repos</w:t>
+      </w:r>
+      <w:proofErr w:type="spellEnd"/>
+      <w:r>
+        <w:t>/          #</w:t>
       </w:r>
       <w:proofErr w:type="gramEnd"/>
       <w:r>
-        <w:t xml:space="preserve"> Orchestrates core services &amp; Python ML</w:t>
-      </w:r>
-    </w:p>
-    <w:p>
-      <w:proofErr w:type="gramStart"/>
-      <w:r>
-        <w:t xml:space="preserve">│   │   </w:t>
-      </w:r>
-      <w:r>
-        <w:rPr>
-          <w:rFonts w:ascii="MS Gothic" w:eastAsia="MS Gothic" w:hAnsi="MS Gothic" w:cs="MS Gothic" w:hint="eastAsia"/>
-        </w:rPr>
-        <w:t>├</w:t>
-      </w:r>
-      <w:r>
-        <w:rPr>
-          <w:rFonts w:ascii="Aptos" w:hAnsi="Aptos" w:cs="Aptos"/>
-        </w:rPr>
-        <w:t>──</w:t>
-      </w:r>
-      <w:r>
-        <w:t xml:space="preserve"> model/             #</w:t>
-      </w:r>
-      <w:proofErr w:type="gramEnd"/>
-      <w:r>
-        <w:t xml:space="preserve"> DTOs for repo data, vulnerabilities</w:t>
-      </w:r>
-    </w:p>
-    <w:p>
-      <w:r>
-        <w:t>│   │   └── config/            # CORS, Swagger, etc.</w:t>
-      </w:r>
-    </w:p>
-    <w:p>
-      <w:r>
-        <w:t xml:space="preserve">│   </w:t>
-      </w:r>
-      <w:r>
-        <w:rPr>
-          <w:rFonts w:ascii="MS Gothic" w:eastAsia="MS Gothic" w:hAnsi="MS Gothic" w:cs="MS Gothic" w:hint="eastAsia"/>
-        </w:rPr>
-        <w:t>├</w:t>
-      </w:r>
-      <w:r>
-        <w:rPr>
-          <w:rFonts w:ascii="Aptos" w:hAnsi="Aptos" w:cs="Aptos"/>
-        </w:rPr>
-        <w:t>──</w:t>
-      </w:r>
-      <w:r>
-        <w:t xml:space="preserve"> </w:t>
-      </w:r>
-      <w:proofErr w:type="spellStart"/>
-      <w:r>
-        <w:t>src</w:t>
-      </w:r>
-      <w:proofErr w:type="spellEnd"/>
-      <w:r>
-        <w:t>/main/resources/</w:t>
-      </w:r>
-    </w:p>
-    <w:p>
-      <w:r>
-        <w:t xml:space="preserve">│   │   └── </w:t>
-      </w:r>
-      <w:proofErr w:type="spellStart"/>
-      <w:r>
-        <w:t>application.yml</w:t>
-      </w:r>
-      <w:proofErr w:type="spellEnd"/>
-      <w:r>
-        <w:t xml:space="preserve">    # DB configs</w:t>
-      </w:r>
-    </w:p>
-    <w:p>
-      <w:r>
-        <w:t xml:space="preserve">│   </w:t>
-      </w:r>
-      <w:r>
-        <w:rPr>
-          <w:rFonts w:ascii="MS Gothic" w:eastAsia="MS Gothic" w:hAnsi="MS Gothic" w:cs="MS Gothic" w:hint="eastAsia"/>
-        </w:rPr>
-        <w:t>├</w:t>
-      </w:r>
-      <w:r>
-        <w:rPr>
-          <w:rFonts w:ascii="Aptos" w:hAnsi="Aptos" w:cs="Aptos"/>
-        </w:rPr>
-        <w:t>──</w:t>
-      </w:r>
-      <w:r>
-        <w:t xml:space="preserve"> pom.xml                # Maven dependencies</w:t>
-      </w:r>
-    </w:p>
-    <w:p>
-      <w:r>
-        <w:t xml:space="preserve">│   └── </w:t>
-      </w:r>
-      <w:proofErr w:type="spellStart"/>
-      <w:r>
-        <w:t>Dockerfile</w:t>
-      </w:r>
-      <w:proofErr w:type="spellEnd"/>
-    </w:p>
-    <w:p>
-      <w:r>
-        <w:t>│</w:t>
-      </w:r>
-    </w:p>
-    <w:p>
-      <w:r>
-        <w:rPr>
-          <w:rFonts w:ascii="MS Gothic" w:eastAsia="MS Gothic" w:hAnsi="MS Gothic" w:cs="MS Gothic" w:hint="eastAsia"/>
-        </w:rPr>
-        <w:t>├</w:t>
-      </w:r>
-      <w:r>
-        <w:rPr>
-          <w:rFonts w:ascii="Aptos" w:hAnsi="Aptos" w:cs="Aptos"/>
-        </w:rPr>
-        <w:t>──</w:t>
-      </w:r>
-      <w:r>
-        <w:t xml:space="preserve"> ai-ml-</w:t>
-      </w:r>
-      <w:proofErr w:type="gramStart"/>
-      <w:r>
-        <w:t>services/            #</w:t>
-      </w:r>
-      <w:proofErr w:type="gramEnd"/>
-      <w:r>
-        <w:t xml:space="preserve"> Python AI layer</w:t>
-      </w:r>
-    </w:p>
-    <w:p>
-      <w:r>
-        <w:t xml:space="preserve">│   </w:t>
-      </w:r>
-      <w:r>
-        <w:rPr>
-          <w:rFonts w:ascii="MS Gothic" w:eastAsia="MS Gothic" w:hAnsi="MS Gothic" w:cs="MS Gothic" w:hint="eastAsia"/>
-        </w:rPr>
-        <w:t>├</w:t>
-      </w:r>
-      <w:r>
-        <w:rPr>
-          <w:rFonts w:ascii="Aptos" w:hAnsi="Aptos" w:cs="Aptos"/>
-        </w:rPr>
-        <w:t>──</w:t>
-      </w:r>
-      <w:r>
-        <w:t xml:space="preserve"> </w:t>
-      </w:r>
-      <w:proofErr w:type="spellStart"/>
-      <w:r>
-        <w:t>risk_model</w:t>
-      </w:r>
-      <w:proofErr w:type="spellEnd"/>
-      <w:r>
-        <w:t>/</w:t>
-      </w:r>
-    </w:p>
-    <w:p>
-      <w:r>
-        <w:t xml:space="preserve">│   │   </w:t>
-      </w:r>
-      <w:r>
-        <w:rPr>
-          <w:rFonts w:ascii="MS Gothic" w:eastAsia="MS Gothic" w:hAnsi="MS Gothic" w:cs="MS Gothic" w:hint="eastAsia"/>
-        </w:rPr>
-        <w:t>├</w:t>
-      </w:r>
-      <w:r>
-        <w:rPr>
-          <w:rFonts w:ascii="Aptos" w:hAnsi="Aptos" w:cs="Aptos"/>
-        </w:rPr>
-        <w:t>──</w:t>
-      </w:r>
-      <w:r>
-        <w:t xml:space="preserve"> train_model.py     # ML model for release risk prediction</w:t>
-      </w:r>
-    </w:p>
-    <w:p>
-      <w:r>
-        <w:t xml:space="preserve">│   │   </w:t>
-      </w:r>
-      <w:r>
-        <w:rPr>
-          <w:rFonts w:ascii="MS Gothic" w:eastAsia="MS Gothic" w:hAnsi="MS Gothic" w:cs="MS Gothic" w:hint="eastAsia"/>
-        </w:rPr>
-        <w:t>├</w:t>
-      </w:r>
-      <w:r>
-        <w:rPr>
-          <w:rFonts w:ascii="Aptos" w:hAnsi="Aptos" w:cs="Aptos"/>
-        </w:rPr>
-        <w:t>──</w:t>
-      </w:r>
-      <w:r>
-        <w:t xml:space="preserve"> </w:t>
-      </w:r>
-      <w:proofErr w:type="gramStart"/>
-      <w:r>
-        <w:t>risk_predictor.py  #</w:t>
-      </w:r>
-      <w:proofErr w:type="gramEnd"/>
-      <w:r>
-        <w:t xml:space="preserve"> API for scoring risks</w:t>
-      </w:r>
-    </w:p>
-    <w:p>
-      <w:r>
-        <w:t>│   │   └── requirements.txt</w:t>
-      </w:r>
-    </w:p>
-    <w:p>
-      <w:r>
-        <w:t xml:space="preserve">│   </w:t>
-      </w:r>
-      <w:r>
-        <w:rPr>
-          <w:rFonts w:ascii="MS Gothic" w:eastAsia="MS Gothic" w:hAnsi="MS Gothic" w:cs="MS Gothic" w:hint="eastAsia"/>
-        </w:rPr>
-        <w:t>├</w:t>
-      </w:r>
-      <w:r>
-        <w:rPr>
-          <w:rFonts w:ascii="Aptos" w:hAnsi="Aptos" w:cs="Aptos"/>
-        </w:rPr>
-        <w:t>──</w:t>
-      </w:r>
-      <w:r>
-        <w:t xml:space="preserve"> </w:t>
-      </w:r>
-      <w:proofErr w:type="spellStart"/>
-      <w:r>
-        <w:t>nlp_explainer</w:t>
-      </w:r>
-      <w:proofErr w:type="spellEnd"/>
-      <w:r>
-        <w:t>/</w:t>
-      </w:r>
-    </w:p>
-    <w:p>
-      <w:r>
-        <w:t xml:space="preserve">│   │   </w:t>
-      </w:r>
-      <w:r>
-        <w:rPr>
-          <w:rFonts w:ascii="MS Gothic" w:eastAsia="MS Gothic" w:hAnsi="MS Gothic" w:cs="MS Gothic" w:hint="eastAsia"/>
-        </w:rPr>
-        <w:t>├</w:t>
-      </w:r>
-      <w:r>
-        <w:rPr>
-          <w:rFonts w:ascii="Aptos" w:hAnsi="Aptos" w:cs="Aptos"/>
-        </w:rPr>
-        <w:t>──</w:t>
-      </w:r>
-      <w:r>
-        <w:t xml:space="preserve"> explain_issue.py   # NLP-based issue summaries</w:t>
-      </w:r>
-    </w:p>
-    <w:p>
-      <w:r>
-        <w:t>│   │   └── alternative_suggester.py</w:t>
-      </w:r>
-    </w:p>
-    <w:p>
-      <w:r>
-        <w:t xml:space="preserve">│   </w:t>
-      </w:r>
-      <w:r>
-        <w:rPr>
-          <w:rFonts w:ascii="MS Gothic" w:eastAsia="MS Gothic" w:hAnsi="MS Gothic" w:cs="MS Gothic" w:hint="eastAsia"/>
-        </w:rPr>
-        <w:t>├</w:t>
-      </w:r>
-      <w:r>
-        <w:rPr>
-          <w:rFonts w:ascii="Aptos" w:hAnsi="Aptos" w:cs="Aptos"/>
-        </w:rPr>
-        <w:t>──</w:t>
-      </w:r>
-      <w:r>
-        <w:t xml:space="preserve"> </w:t>
-      </w:r>
-      <w:proofErr w:type="spellStart"/>
-      <w:r>
-        <w:t>knowledge_graph</w:t>
-      </w:r>
-      <w:proofErr w:type="spellEnd"/>
-      <w:r>
-        <w:t>/</w:t>
-      </w:r>
-    </w:p>
-    <w:p>
-      <w:r>
-        <w:t>│   │   └── build_graph.py     # Entity extraction + graph relationships</w:t>
-      </w:r>
-    </w:p>
-    <w:p>
-      <w:r>
-        <w:t xml:space="preserve">│   </w:t>
-      </w:r>
-      <w:r>
-        <w:rPr>
-          <w:rFonts w:ascii="MS Gothic" w:eastAsia="MS Gothic" w:hAnsi="MS Gothic" w:cs="MS Gothic" w:hint="eastAsia"/>
-        </w:rPr>
-        <w:t>├</w:t>
-      </w:r>
-      <w:r>
-        <w:rPr>
-          <w:rFonts w:ascii="Aptos" w:hAnsi="Aptos" w:cs="Aptos"/>
-        </w:rPr>
-        <w:t>──</w:t>
-      </w:r>
-      <w:r>
-        <w:t xml:space="preserve"> </w:t>
-      </w:r>
-      <w:proofErr w:type="spellStart"/>
-      <w:r>
-        <w:t>security_scanner</w:t>
-      </w:r>
-      <w:proofErr w:type="spellEnd"/>
-      <w:r>
-        <w:t>/</w:t>
-      </w:r>
-    </w:p>
-    <w:p>
-      <w:r>
-        <w:t>│   │   └── vulnerability_check.py # Uses NVD/</w:t>
-      </w:r>
-      <w:proofErr w:type="spellStart"/>
-      <w:r>
-        <w:t>OSSIndex</w:t>
-      </w:r>
-      <w:proofErr w:type="spellEnd"/>
-      <w:r>
-        <w:t xml:space="preserve"> APIs</w:t>
-      </w:r>
-    </w:p>
-    <w:p>
-      <w:r>
-        <w:t>│   └── fastapi_app.py         # Exposes ML/NLP services as APIs</w:t>
-      </w:r>
-    </w:p>
-    <w:p>
-      <w:r>
-        <w:t>│</w:t>
-      </w:r>
-    </w:p>
-    <w:p>
-      <w:proofErr w:type="gramStart"/>
-      <w:r>
-        <w:rPr>
-          <w:rFonts w:ascii="MS Gothic" w:eastAsia="MS Gothic" w:hAnsi="MS Gothic" w:cs="MS Gothic" w:hint="eastAsia"/>
-        </w:rPr>
-        <w:t>├</w:t>
-      </w:r>
-      <w:r>
-        <w:rPr>
-          <w:rFonts w:ascii="Aptos" w:hAnsi="Aptos" w:cs="Aptos"/>
-        </w:rPr>
-        <w:t>──</w:t>
-      </w:r>
-      <w:r>
-        <w:t xml:space="preserve"> data/                      #</w:t>
-      </w:r>
-      <w:proofErr w:type="gramEnd"/>
-      <w:r>
-        <w:t xml:space="preserve"> Collected data &amp; DB scripts</w:t>
-      </w:r>
-    </w:p>
-    <w:p>
-      <w:r>
-        <w:t xml:space="preserve">│   </w:t>
-      </w:r>
-      <w:r>
-        <w:rPr>
-          <w:rFonts w:ascii="MS Gothic" w:eastAsia="MS Gothic" w:hAnsi="MS Gothic" w:cs="MS Gothic" w:hint="eastAsia"/>
-        </w:rPr>
-        <w:t>├</w:t>
-      </w:r>
-      <w:r>
-        <w:rPr>
-          <w:rFonts w:ascii="Aptos" w:hAnsi="Aptos" w:cs="Aptos"/>
-        </w:rPr>
-        <w:t>──</w:t>
-      </w:r>
-      <w:r>
-        <w:t xml:space="preserve"> </w:t>
-      </w:r>
-      <w:proofErr w:type="spellStart"/>
-      <w:r>
-        <w:t>sample_</w:t>
-      </w:r>
-      <w:proofErr w:type="gramStart"/>
-      <w:r>
-        <w:t>repos</w:t>
-      </w:r>
-      <w:proofErr w:type="spellEnd"/>
-      <w:r>
-        <w:t>/          #</w:t>
-      </w:r>
-      <w:proofErr w:type="gramEnd"/>
-      <w:r>
         <w:t xml:space="preserve"> Cloned GitHub repos for testing</w:t>
       </w:r>
     </w:p>
     <w:p>
       <w:r>
-        <w:lastRenderedPageBreak/>
         <w:t xml:space="preserve">│   </w:t>
       </w:r>
       <w:r>
@@ -3350,7 +4362,7 @@
     <w:p>
       <w:r>
         <w:pict w14:anchorId="18E9B020">
-          <v:rect id="_x0000_i1141" style="width:0;height:1.5pt" o:hralign="center" o:hrstd="t" o:hr="t" fillcolor="#a0a0a0" stroked="f"/>
+          <v:rect id="_x0000_i1035" style="width:0;height:1.5pt" o:hralign="center" o:hrstd="t" o:hr="t" fillcolor="#a0a0a0" stroked="f"/>
         </w:pict>
       </w:r>
     </w:p>
@@ -3462,6 +4474,7 @@
     </w:p>
     <w:p>
       <w:r>
+        <w:lastRenderedPageBreak/>
         <w:t>2️</w:t>
       </w:r>
       <w:r>
@@ -3550,7 +4563,6 @@
           <w:b/>
           <w:bCs/>
         </w:rPr>
-        <w:lastRenderedPageBreak/>
         <w:t>OSS Index API</w:t>
       </w:r>
       <w:r>
@@ -3746,7 +4758,7 @@
     <w:p>
       <w:r>
         <w:pict w14:anchorId="581680A2">
-          <v:rect id="_x0000_i1142" style="width:0;height:1.5pt" o:hralign="center" o:hrstd="t" o:hr="t" fillcolor="#a0a0a0" stroked="f"/>
+          <v:rect id="_x0000_i1036" style="width:0;height:1.5pt" o:hralign="center" o:hrstd="t" o:hr="t" fillcolor="#a0a0a0" stroked="f"/>
         </w:pict>
       </w:r>
     </w:p>
@@ -3903,6 +4915,7 @@
           <w:b/>
           <w:bCs/>
         </w:rPr>
+        <w:lastRenderedPageBreak/>
         <w:t>Java 21 + Spring Boot 3.x</w:t>
       </w:r>
     </w:p>
@@ -3974,7 +4987,6 @@
           <w:b/>
           <w:bCs/>
         </w:rPr>
-        <w:lastRenderedPageBreak/>
         <w:t>Spring Data JPA</w:t>
       </w:r>
       <w:r>
@@ -4309,7 +5321,7 @@
     <w:p>
       <w:r>
         <w:pict w14:anchorId="7251ABDA">
-          <v:rect id="_x0000_i1143" style="width:0;height:1.5pt" o:hralign="center" o:hrstd="t" o:hr="t" fillcolor="#a0a0a0" stroked="f"/>
+          <v:rect id="_x0000_i1037" style="width:0;height:1.5pt" o:hralign="center" o:hrstd="t" o:hr="t" fillcolor="#a0a0a0" stroked="f"/>
         </w:pict>
       </w:r>
     </w:p>
@@ -4365,6 +5377,7 @@
     </w:p>
     <w:p>
       <w:r>
+        <w:lastRenderedPageBreak/>
         <w:t>&lt;dependencies&gt;</w:t>
       </w:r>
     </w:p>
@@ -4443,7 +5456,6 @@
     </w:p>
     <w:p>
       <w:r>
-        <w:lastRenderedPageBreak/>
         <w:t xml:space="preserve">  &lt;/dependency&gt;</w:t>
       </w:r>
     </w:p>
@@ -4742,6 +5754,7 @@
     </w:p>
     <w:p>
       <w:r>
+        <w:lastRenderedPageBreak/>
         <w:t xml:space="preserve">    &lt;</w:t>
       </w:r>
       <w:proofErr w:type="spellStart"/>
@@ -4782,7 +5795,7 @@
     <w:p>
       <w:r>
         <w:pict w14:anchorId="423AC4B4">
-          <v:rect id="_x0000_i1144" style="width:0;height:1.5pt" o:hralign="center" o:hrstd="t" o:hr="t" fillcolor="#a0a0a0" stroked="f"/>
+          <v:rect id="_x0000_i1038" style="width:0;height:1.5pt" o:hralign="center" o:hrstd="t" o:hr="t" fillcolor="#a0a0a0" stroked="f"/>
         </w:pict>
       </w:r>
     </w:p>
@@ -4803,7 +5816,6 @@
     </w:p>
     <w:p>
       <w:r>
-        <w:lastRenderedPageBreak/>
         <w:t>json</w:t>
       </w:r>
     </w:p>
@@ -4888,7 +5900,7 @@
     <w:p>
       <w:r>
         <w:pict w14:anchorId="639906A1">
-          <v:rect id="_x0000_i1145" style="width:0;height:1.5pt" o:hralign="center" o:hrstd="t" o:hr="t" fillcolor="#a0a0a0" stroked="f"/>
+          <v:rect id="_x0000_i1039" style="width:0;height:1.5pt" o:hralign="center" o:hrstd="t" o:hr="t" fillcolor="#a0a0a0" stroked="f"/>
         </w:pict>
       </w:r>
     </w:p>
@@ -4978,6 +5990,7 @@
     </w:p>
     <w:p>
       <w:r>
+        <w:lastRenderedPageBreak/>
         <w:t>requests==2.31</w:t>
       </w:r>
     </w:p>
@@ -4997,7 +6010,7 @@
     <w:p>
       <w:r>
         <w:pict w14:anchorId="00A03525">
-          <v:rect id="_x0000_i1146" style="width:0;height:1.5pt" o:hralign="center" o:hrstd="t" o:hr="t" fillcolor="#a0a0a0" stroked="f"/>
+          <v:rect id="_x0000_i1040" style="width:0;height:1.5pt" o:hralign="center" o:hrstd="t" o:hr="t" fillcolor="#a0a0a0" stroked="f"/>
         </w:pict>
       </w:r>
     </w:p>
@@ -5054,7 +6067,6 @@
           <w:b/>
           <w:bCs/>
         </w:rPr>
-        <w:lastRenderedPageBreak/>
         <w:t>Backend (Spring Boot)</w:t>
       </w:r>
       <w:r>
@@ -8876,6 +9888,7 @@
   <w:style w:type="character" w:default="1" w:styleId="DefaultParagraphFont">
     <w:name w:val="Default Paragraph Font"/>
     <w:uiPriority w:val="1"/>
+    <w:semiHidden/>
     <w:unhideWhenUsed/>
   </w:style>
   <w:style w:type="table" w:default="1" w:styleId="TableNormal">
@@ -9187,6 +10200,17 @@
       <w:smallCaps/>
       <w:color w:val="0F4761" w:themeColor="accent1" w:themeShade="BF"/>
       <w:spacing w:val="5"/>
+    </w:rPr>
+  </w:style>
+  <w:style w:type="character" w:styleId="Strong">
+    <w:name w:val="Strong"/>
+    <w:basedOn w:val="DefaultParagraphFont"/>
+    <w:uiPriority w:val="22"/>
+    <w:qFormat/>
+    <w:rsid w:val="004D0395"/>
+    <w:rPr>
+      <w:b/>
+      <w:bCs/>
     </w:rPr>
   </w:style>
 </w:styles>

</xml_diff>